<commit_message>
Hefteintrag als Mindmap mit Wolken-Überschriften und Bild
Co-Authored-By: Claude Opus 5.5 <noreply@anthropic.com>
Claude-Session: https://claude.ai/code/session_01FTW1Jxo9dMCKUL1bcqqfs9
</commit_message>
<xml_diff>
--- a/Arbeitsplatz_Kfz-Mechatroniker.docx
+++ b/Arbeitsplatz_Kfz-Mechatroniker.docx
@@ -28,257 +28,1111 @@
           <w:rFonts w:ascii="Comic Sans MS" w:cs="Comic Sans MS" w:eastAsia="Comic Sans MS" w:hAnsi="Comic Sans MS"/>
           <w:i/>
           <w:iCs/>
-          <w:sz w:val="24"/>
-          <w:szCs w:val="24"/>
-        </w:rPr>
-        <w:t xml:space="preserve">Lies die Texte 1–5 und notiere Stichpunkte unter der passenden Überschrift.</w:t>
+          <w:sz w:val="21"/>
+          <w:szCs w:val="21"/>
+        </w:rPr>
+        <w:t xml:space="preserve">Lies die Texte 1–5 (oder hör sie dir an) und notiere Stichpunkte unter der passenden Überschrift.</w:t>
       </w:r>
     </w:p>
     <w:tbl>
       <w:tblPr>
         <w:tblW w:type="dxa" w:w="10632"/>
         <w:tblBorders>
-          <w:top w:val="single" w:color="auto" w:sz="4"/>
-          <w:left w:val="single" w:color="auto" w:sz="4"/>
-          <w:bottom w:val="single" w:color="auto" w:sz="4"/>
-          <w:right w:val="single" w:color="auto" w:sz="4"/>
-          <w:insideH w:val="single" w:color="auto" w:sz="4"/>
-          <w:insideV w:val="single" w:color="auto" w:sz="4"/>
+          <w:top w:val="none" w:color="FFFFFF" w:sz="0"/>
+          <w:left w:val="none" w:color="FFFFFF" w:sz="0"/>
+          <w:bottom w:val="none" w:color="FFFFFF" w:sz="0"/>
+          <w:right w:val="none" w:color="FFFFFF" w:sz="0"/>
+          <w:insideH w:val="none" w:color="FFFFFF" w:sz="0"/>
+          <w:insideV w:val="none" w:color="FFFFFF" w:sz="0"/>
         </w:tblBorders>
       </w:tblPr>
       <w:tblGrid>
-        <w:gridCol w:w="5316"/>
-        <w:gridCol w:w="5316"/>
+        <w:gridCol w:w="3900"/>
+        <w:gridCol w:w="2832"/>
+        <w:gridCol w:w="3900"/>
       </w:tblGrid>
       <w:tr>
         <w:trPr>
-          <w:trHeight w:val="4100" w:hRule="atLeast"/>
+          <w:cantSplit/>
+          <w:trHeight w:val="4600" w:hRule="atLeast"/>
         </w:trPr>
         <w:tc>
           <w:tcPr>
-            <w:tcW w:type="dxa" w:w="5316"/>
+            <w:tcW w:type="dxa" w:w="3900"/>
             <w:tcBorders>
-              <w:top w:val="single" w:color="1F4E9E" w:sz="12"/>
-              <w:left w:val="single" w:color="1F4E9E" w:sz="12"/>
-              <w:bottom w:val="single" w:color="1F4E9E" w:sz="12"/>
-              <w:right w:val="single" w:color="1F4E9E" w:sz="12"/>
+              <w:top w:val="none" w:color="FFFFFF" w:sz="0"/>
+              <w:left w:val="none" w:color="FFFFFF" w:sz="0"/>
+              <w:bottom w:val="none" w:color="FFFFFF" w:sz="0"/>
+              <w:right w:val="none" w:color="FFFFFF" w:sz="0"/>
             </w:tcBorders>
             <w:tcMar>
-              <w:top w:type="dxa" w:w="120"/>
-              <w:left w:type="dxa" w:w="160"/>
-              <w:bottom w:type="dxa" w:w="120"/>
-              <w:right w:type="dxa" w:w="160"/>
+              <w:top w:type="dxa" w:w="60"/>
+              <w:left w:type="dxa" w:w="80"/>
+              <w:right w:type="dxa" w:w="80"/>
             </w:tcMar>
           </w:tcPr>
           <w:p>
             <w:pPr>
-              <w:shd w:fill="DCE6F5" w:color="auto" w:val="clear"/>
-              <w:spacing w:after="160"/>
+              <w:spacing w:after="60"/>
               <w:jc w:val="center"/>
             </w:pPr>
             <w:r>
-              <w:rPr>
-                <w:rFonts w:ascii="Comic Sans MS" w:cs="Comic Sans MS" w:eastAsia="Comic Sans MS" w:hAnsi="Comic Sans MS"/>
-                <w:b/>
-                <w:bCs/>
-                <w:color w:val="1F4E9E"/>
+              <w:drawing>
+                <wp:inline distT="0" distB="0" distL="0" distR="0">
+                  <wp:extent cx="2381250" cy="819150"/>
+                  <wp:effectExtent t="0" r="0" b="0" l="0"/>
+                  <wp:docPr id="1" name="" descr="" title=""/>
+                  <wp:cNvGraphicFramePr>
+                    <a:graphicFrameLocks xmlns:a="http://schemas.openxmlformats.org/drawingml/2006/main" noChangeAspect="1"/>
+                  </wp:cNvGraphicFramePr>
+                  <a:graphic xmlns:a="http://schemas.openxmlformats.org/drawingml/2006/main">
+                    <a:graphicData uri="http://schemas.openxmlformats.org/drawingml/2006/picture">
+                      <pic:pic xmlns:pic="http://schemas.openxmlformats.org/drawingml/2006/picture">
+                        <pic:nvPicPr>
+                          <pic:cNvPr id="0" name="" descr=""/>
+                          <pic:cNvPicPr>
+                            <a:picLocks noChangeAspect="1" noChangeArrowheads="1"/>
+                          </pic:cNvPicPr>
+                        </pic:nvPicPr>
+                        <pic:blipFill>
+                          <a:blip r:embed="rId7" cstate="none"/>
+                          <a:srcRect/>
+                          <a:stretch>
+                            <a:fillRect/>
+                          </a:stretch>
+                        </pic:blipFill>
+                        <pic:spPr bwMode="auto">
+                          <a:xfrm>
+                            <a:off x="0" y="0"/>
+                            <a:ext cx="2381250" cy="819150"/>
+                          </a:xfrm>
+                          <a:prstGeom prst="rect">
+                            <a:avLst/>
+                          </a:prstGeom>
+                        </pic:spPr>
+                      </pic:pic>
+                    </a:graphicData>
+                  </a:graphic>
+                </wp:inline>
+              </w:drawing>
+            </w:r>
+          </w:p>
+          <w:p>
+            <w:pPr>
+              <w:tabs>
+                <w:tab w:val="right" w:pos="3640" w:leader="underscore"/>
+              </w:tabs>
+              <w:spacing w:before="250"/>
+            </w:pPr>
+            <w:r>
+              <w:rPr>
+                <w:rFonts w:ascii="Comic Sans MS" w:cs="Comic Sans MS" w:eastAsia="Comic Sans MS" w:hAnsi="Comic Sans MS"/>
+                <w:color w:val="9FB0C6"/>
                 <w:sz w:val="24"/>
                 <w:szCs w:val="24"/>
               </w:rPr>
-              <w:t xml:space="preserve">Tätigkeiten am Arbeitsplatz</w:t>
-            </w:r>
-          </w:p>
+              <w:t xml:space="preserve">	</w:t>
+            </w:r>
+          </w:p>
+          <w:p>
+            <w:pPr>
+              <w:tabs>
+                <w:tab w:val="right" w:pos="3640" w:leader="underscore"/>
+              </w:tabs>
+              <w:spacing w:before="250"/>
+            </w:pPr>
+            <w:r>
+              <w:rPr>
+                <w:rFonts w:ascii="Comic Sans MS" w:cs="Comic Sans MS" w:eastAsia="Comic Sans MS" w:hAnsi="Comic Sans MS"/>
+                <w:color w:val="9FB0C6"/>
+                <w:sz w:val="24"/>
+                <w:szCs w:val="24"/>
+              </w:rPr>
+              <w:t xml:space="preserve">	</w:t>
+            </w:r>
+          </w:p>
+          <w:p>
+            <w:pPr>
+              <w:tabs>
+                <w:tab w:val="right" w:pos="3640" w:leader="underscore"/>
+              </w:tabs>
+              <w:spacing w:before="250"/>
+            </w:pPr>
+            <w:r>
+              <w:rPr>
+                <w:rFonts w:ascii="Comic Sans MS" w:cs="Comic Sans MS" w:eastAsia="Comic Sans MS" w:hAnsi="Comic Sans MS"/>
+                <w:color w:val="9FB0C6"/>
+                <w:sz w:val="24"/>
+                <w:szCs w:val="24"/>
+              </w:rPr>
+              <w:t xml:space="preserve">	</w:t>
+            </w:r>
+          </w:p>
+          <w:p>
+            <w:pPr>
+              <w:tabs>
+                <w:tab w:val="right" w:pos="3640" w:leader="underscore"/>
+              </w:tabs>
+              <w:spacing w:before="250"/>
+            </w:pPr>
+            <w:r>
+              <w:rPr>
+                <w:rFonts w:ascii="Comic Sans MS" w:cs="Comic Sans MS" w:eastAsia="Comic Sans MS" w:hAnsi="Comic Sans MS"/>
+                <w:color w:val="9FB0C6"/>
+                <w:sz w:val="24"/>
+                <w:szCs w:val="24"/>
+              </w:rPr>
+              <w:t xml:space="preserve">	</w:t>
+            </w:r>
+          </w:p>
+          <w:p>
+            <w:pPr>
+              <w:tabs>
+                <w:tab w:val="right" w:pos="3640" w:leader="underscore"/>
+              </w:tabs>
+              <w:spacing w:before="250"/>
+            </w:pPr>
+            <w:r>
+              <w:rPr>
+                <w:rFonts w:ascii="Comic Sans MS" w:cs="Comic Sans MS" w:eastAsia="Comic Sans MS" w:hAnsi="Comic Sans MS"/>
+                <w:color w:val="9FB0C6"/>
+                <w:sz w:val="24"/>
+                <w:szCs w:val="24"/>
+              </w:rPr>
+              <w:t xml:space="preserve">	</w:t>
+            </w:r>
+          </w:p>
+          <w:p>
+            <w:pPr>
+              <w:tabs>
+                <w:tab w:val="right" w:pos="3640" w:leader="underscore"/>
+              </w:tabs>
+              <w:spacing w:before="250"/>
+            </w:pPr>
+            <w:r>
+              <w:rPr>
+                <w:rFonts w:ascii="Comic Sans MS" w:cs="Comic Sans MS" w:eastAsia="Comic Sans MS" w:hAnsi="Comic Sans MS"/>
+                <w:color w:val="9FB0C6"/>
+                <w:sz w:val="24"/>
+                <w:szCs w:val="24"/>
+              </w:rPr>
+              <w:t xml:space="preserve">	</w:t>
+            </w:r>
+          </w:p>
+        </w:tc>
+        <w:tc>
+          <w:tcPr>
+            <w:tcW w:type="dxa" w:w="2832"/>
+            <w:vMerge w:val="restart"/>
+            <w:tcBorders>
+              <w:top w:val="none" w:color="FFFFFF" w:sz="0"/>
+              <w:left w:val="none" w:color="FFFFFF" w:sz="0"/>
+              <w:bottom w:val="none" w:color="FFFFFF" w:sz="0"/>
+              <w:right w:val="none" w:color="FFFFFF" w:sz="0"/>
+            </w:tcBorders>
+            <w:vAlign w:val="center"/>
+          </w:tcPr>
+          <w:p>
+            <w:pPr>
+              <w:jc w:val="center"/>
+            </w:pPr>
+            <w:r>
+              <w:drawing>
+                <wp:inline distT="0" distB="0" distL="0" distR="0">
+                  <wp:extent cx="1714500" cy="1895475"/>
+                  <wp:effectExtent t="0" r="0" b="0" l="0"/>
+                  <wp:docPr id="1" name="" descr="" title=""/>
+                  <wp:cNvGraphicFramePr>
+                    <a:graphicFrameLocks xmlns:a="http://schemas.openxmlformats.org/drawingml/2006/main" noChangeAspect="1"/>
+                  </wp:cNvGraphicFramePr>
+                  <a:graphic xmlns:a="http://schemas.openxmlformats.org/drawingml/2006/main">
+                    <a:graphicData uri="http://schemas.openxmlformats.org/drawingml/2006/picture">
+                      <pic:pic xmlns:pic="http://schemas.openxmlformats.org/drawingml/2006/picture">
+                        <pic:nvPicPr>
+                          <pic:cNvPr id="0" name="" descr=""/>
+                          <pic:cNvPicPr>
+                            <a:picLocks noChangeAspect="1" noChangeArrowheads="1"/>
+                          </pic:cNvPicPr>
+                        </pic:nvPicPr>
+                        <pic:blipFill>
+                          <a:blip r:embed="rId8" cstate="none"/>
+                          <a:srcRect/>
+                          <a:stretch>
+                            <a:fillRect/>
+                          </a:stretch>
+                        </pic:blipFill>
+                        <pic:spPr bwMode="auto">
+                          <a:xfrm>
+                            <a:off x="0" y="0"/>
+                            <a:ext cx="1714500" cy="1895475"/>
+                          </a:xfrm>
+                          <a:prstGeom prst="rect">
+                            <a:avLst/>
+                          </a:prstGeom>
+                        </pic:spPr>
+                      </pic:pic>
+                    </a:graphicData>
+                  </a:graphic>
+                </wp:inline>
+              </w:drawing>
+            </w:r>
+          </w:p>
+        </w:tc>
+        <w:tc>
+          <w:tcPr>
+            <w:tcW w:type="dxa" w:w="3900"/>
+            <w:tcBorders>
+              <w:top w:val="none" w:color="FFFFFF" w:sz="0"/>
+              <w:left w:val="none" w:color="FFFFFF" w:sz="0"/>
+              <w:bottom w:val="none" w:color="FFFFFF" w:sz="0"/>
+              <w:right w:val="none" w:color="FFFFFF" w:sz="0"/>
+            </w:tcBorders>
+            <w:tcMar>
+              <w:top w:type="dxa" w:w="60"/>
+              <w:left w:type="dxa" w:w="80"/>
+              <w:right w:type="dxa" w:w="80"/>
+            </w:tcMar>
+          </w:tcPr>
+          <w:p>
+            <w:pPr>
+              <w:spacing w:after="60"/>
+              <w:jc w:val="center"/>
+            </w:pPr>
+            <w:r>
+              <w:drawing>
+                <wp:inline distT="0" distB="0" distL="0" distR="0">
+                  <wp:extent cx="2381250" cy="819150"/>
+                  <wp:effectExtent t="0" r="0" b="0" l="0"/>
+                  <wp:docPr id="1" name="" descr="" title=""/>
+                  <wp:cNvGraphicFramePr>
+                    <a:graphicFrameLocks xmlns:a="http://schemas.openxmlformats.org/drawingml/2006/main" noChangeAspect="1"/>
+                  </wp:cNvGraphicFramePr>
+                  <a:graphic xmlns:a="http://schemas.openxmlformats.org/drawingml/2006/main">
+                    <a:graphicData uri="http://schemas.openxmlformats.org/drawingml/2006/picture">
+                      <pic:pic xmlns:pic="http://schemas.openxmlformats.org/drawingml/2006/picture">
+                        <pic:nvPicPr>
+                          <pic:cNvPr id="0" name="" descr=""/>
+                          <pic:cNvPicPr>
+                            <a:picLocks noChangeAspect="1" noChangeArrowheads="1"/>
+                          </pic:cNvPicPr>
+                        </pic:nvPicPr>
+                        <pic:blipFill>
+                          <a:blip r:embed="rId9" cstate="none"/>
+                          <a:srcRect/>
+                          <a:stretch>
+                            <a:fillRect/>
+                          </a:stretch>
+                        </pic:blipFill>
+                        <pic:spPr bwMode="auto">
+                          <a:xfrm>
+                            <a:off x="0" y="0"/>
+                            <a:ext cx="2381250" cy="819150"/>
+                          </a:xfrm>
+                          <a:prstGeom prst="rect">
+                            <a:avLst/>
+                          </a:prstGeom>
+                        </pic:spPr>
+                      </pic:pic>
+                    </a:graphicData>
+                  </a:graphic>
+                </wp:inline>
+              </w:drawing>
+            </w:r>
+          </w:p>
+          <w:p>
+            <w:pPr>
+              <w:tabs>
+                <w:tab w:val="right" w:pos="3640" w:leader="underscore"/>
+              </w:tabs>
+              <w:spacing w:before="250"/>
+            </w:pPr>
+            <w:r>
+              <w:rPr>
+                <w:rFonts w:ascii="Comic Sans MS" w:cs="Comic Sans MS" w:eastAsia="Comic Sans MS" w:hAnsi="Comic Sans MS"/>
+                <w:color w:val="9FB0C6"/>
+                <w:sz w:val="24"/>
+                <w:szCs w:val="24"/>
+              </w:rPr>
+              <w:t xml:space="preserve">	</w:t>
+            </w:r>
+          </w:p>
+          <w:p>
+            <w:pPr>
+              <w:tabs>
+                <w:tab w:val="right" w:pos="3640" w:leader="underscore"/>
+              </w:tabs>
+              <w:spacing w:before="250"/>
+            </w:pPr>
+            <w:r>
+              <w:rPr>
+                <w:rFonts w:ascii="Comic Sans MS" w:cs="Comic Sans MS" w:eastAsia="Comic Sans MS" w:hAnsi="Comic Sans MS"/>
+                <w:color w:val="9FB0C6"/>
+                <w:sz w:val="24"/>
+                <w:szCs w:val="24"/>
+              </w:rPr>
+              <w:t xml:space="preserve">	</w:t>
+            </w:r>
+          </w:p>
+          <w:p>
+            <w:pPr>
+              <w:tabs>
+                <w:tab w:val="right" w:pos="3640" w:leader="underscore"/>
+              </w:tabs>
+              <w:spacing w:before="250"/>
+            </w:pPr>
+            <w:r>
+              <w:rPr>
+                <w:rFonts w:ascii="Comic Sans MS" w:cs="Comic Sans MS" w:eastAsia="Comic Sans MS" w:hAnsi="Comic Sans MS"/>
+                <w:color w:val="9FB0C6"/>
+                <w:sz w:val="24"/>
+                <w:szCs w:val="24"/>
+              </w:rPr>
+              <w:t xml:space="preserve">	</w:t>
+            </w:r>
+          </w:p>
+          <w:p>
+            <w:pPr>
+              <w:tabs>
+                <w:tab w:val="right" w:pos="3640" w:leader="underscore"/>
+              </w:tabs>
+              <w:spacing w:before="250"/>
+            </w:pPr>
+            <w:r>
+              <w:rPr>
+                <w:rFonts w:ascii="Comic Sans MS" w:cs="Comic Sans MS" w:eastAsia="Comic Sans MS" w:hAnsi="Comic Sans MS"/>
+                <w:color w:val="9FB0C6"/>
+                <w:sz w:val="24"/>
+                <w:szCs w:val="24"/>
+              </w:rPr>
+              <w:t xml:space="preserve">	</w:t>
+            </w:r>
+          </w:p>
+          <w:p>
+            <w:pPr>
+              <w:tabs>
+                <w:tab w:val="right" w:pos="3640" w:leader="underscore"/>
+              </w:tabs>
+              <w:spacing w:before="250"/>
+            </w:pPr>
+            <w:r>
+              <w:rPr>
+                <w:rFonts w:ascii="Comic Sans MS" w:cs="Comic Sans MS" w:eastAsia="Comic Sans MS" w:hAnsi="Comic Sans MS"/>
+                <w:color w:val="9FB0C6"/>
+                <w:sz w:val="24"/>
+                <w:szCs w:val="24"/>
+              </w:rPr>
+              <w:t xml:space="preserve">	</w:t>
+            </w:r>
+          </w:p>
+          <w:p>
+            <w:pPr>
+              <w:tabs>
+                <w:tab w:val="right" w:pos="3640" w:leader="underscore"/>
+              </w:tabs>
+              <w:spacing w:before="250"/>
+            </w:pPr>
+            <w:r>
+              <w:rPr>
+                <w:rFonts w:ascii="Comic Sans MS" w:cs="Comic Sans MS" w:eastAsia="Comic Sans MS" w:hAnsi="Comic Sans MS"/>
+                <w:color w:val="9FB0C6"/>
+                <w:sz w:val="24"/>
+                <w:szCs w:val="24"/>
+              </w:rPr>
+              <w:t xml:space="preserve">	</w:t>
+            </w:r>
+          </w:p>
+        </w:tc>
+      </w:tr>
+      <w:tr>
+        <w:trPr>
+          <w:cantSplit/>
+          <w:trHeight w:val="4600" w:hRule="atLeast"/>
+        </w:trPr>
+        <w:tc>
+          <w:tcPr>
+            <w:tcW w:type="dxa" w:w="3900"/>
+            <w:tcBorders>
+              <w:top w:val="none" w:color="FFFFFF" w:sz="0"/>
+              <w:left w:val="none" w:color="FFFFFF" w:sz="0"/>
+              <w:bottom w:val="none" w:color="FFFFFF" w:sz="0"/>
+              <w:right w:val="none" w:color="FFFFFF" w:sz="0"/>
+            </w:tcBorders>
+            <w:tcMar>
+              <w:top w:type="dxa" w:w="60"/>
+              <w:left w:type="dxa" w:w="80"/>
+              <w:right w:type="dxa" w:w="80"/>
+            </w:tcMar>
+          </w:tcPr>
+          <w:p>
+            <w:pPr>
+              <w:spacing w:after="60"/>
+              <w:jc w:val="center"/>
+            </w:pPr>
+            <w:r>
+              <w:drawing>
+                <wp:inline distT="0" distB="0" distL="0" distR="0">
+                  <wp:extent cx="2381250" cy="819150"/>
+                  <wp:effectExtent t="0" r="0" b="0" l="0"/>
+                  <wp:docPr id="1" name="" descr="" title=""/>
+                  <wp:cNvGraphicFramePr>
+                    <a:graphicFrameLocks xmlns:a="http://schemas.openxmlformats.org/drawingml/2006/main" noChangeAspect="1"/>
+                  </wp:cNvGraphicFramePr>
+                  <a:graphic xmlns:a="http://schemas.openxmlformats.org/drawingml/2006/main">
+                    <a:graphicData uri="http://schemas.openxmlformats.org/drawingml/2006/picture">
+                      <pic:pic xmlns:pic="http://schemas.openxmlformats.org/drawingml/2006/picture">
+                        <pic:nvPicPr>
+                          <pic:cNvPr id="0" name="" descr=""/>
+                          <pic:cNvPicPr>
+                            <a:picLocks noChangeAspect="1" noChangeArrowheads="1"/>
+                          </pic:cNvPicPr>
+                        </pic:nvPicPr>
+                        <pic:blipFill>
+                          <a:blip r:embed="rId10" cstate="none"/>
+                          <a:srcRect/>
+                          <a:stretch>
+                            <a:fillRect/>
+                          </a:stretch>
+                        </pic:blipFill>
+                        <pic:spPr bwMode="auto">
+                          <a:xfrm>
+                            <a:off x="0" y="0"/>
+                            <a:ext cx="2381250" cy="819150"/>
+                          </a:xfrm>
+                          <a:prstGeom prst="rect">
+                            <a:avLst/>
+                          </a:prstGeom>
+                        </pic:spPr>
+                      </pic:pic>
+                    </a:graphicData>
+                  </a:graphic>
+                </wp:inline>
+              </w:drawing>
+            </w:r>
+          </w:p>
+          <w:p>
+            <w:pPr>
+              <w:tabs>
+                <w:tab w:val="right" w:pos="3640" w:leader="underscore"/>
+              </w:tabs>
+              <w:spacing w:before="250"/>
+            </w:pPr>
+            <w:r>
+              <w:rPr>
+                <w:rFonts w:ascii="Comic Sans MS" w:cs="Comic Sans MS" w:eastAsia="Comic Sans MS" w:hAnsi="Comic Sans MS"/>
+                <w:color w:val="9FB0C6"/>
+                <w:sz w:val="24"/>
+                <w:szCs w:val="24"/>
+              </w:rPr>
+              <w:t xml:space="preserve">	</w:t>
+            </w:r>
+          </w:p>
+          <w:p>
+            <w:pPr>
+              <w:tabs>
+                <w:tab w:val="right" w:pos="3640" w:leader="underscore"/>
+              </w:tabs>
+              <w:spacing w:before="250"/>
+            </w:pPr>
+            <w:r>
+              <w:rPr>
+                <w:rFonts w:ascii="Comic Sans MS" w:cs="Comic Sans MS" w:eastAsia="Comic Sans MS" w:hAnsi="Comic Sans MS"/>
+                <w:color w:val="9FB0C6"/>
+                <w:sz w:val="24"/>
+                <w:szCs w:val="24"/>
+              </w:rPr>
+              <w:t xml:space="preserve">	</w:t>
+            </w:r>
+          </w:p>
+          <w:p>
+            <w:pPr>
+              <w:tabs>
+                <w:tab w:val="right" w:pos="3640" w:leader="underscore"/>
+              </w:tabs>
+              <w:spacing w:before="250"/>
+            </w:pPr>
+            <w:r>
+              <w:rPr>
+                <w:rFonts w:ascii="Comic Sans MS" w:cs="Comic Sans MS" w:eastAsia="Comic Sans MS" w:hAnsi="Comic Sans MS"/>
+                <w:color w:val="9FB0C6"/>
+                <w:sz w:val="24"/>
+                <w:szCs w:val="24"/>
+              </w:rPr>
+              <w:t xml:space="preserve">	</w:t>
+            </w:r>
+          </w:p>
+          <w:p>
+            <w:pPr>
+              <w:tabs>
+                <w:tab w:val="right" w:pos="3640" w:leader="underscore"/>
+              </w:tabs>
+              <w:spacing w:before="250"/>
+            </w:pPr>
+            <w:r>
+              <w:rPr>
+                <w:rFonts w:ascii="Comic Sans MS" w:cs="Comic Sans MS" w:eastAsia="Comic Sans MS" w:hAnsi="Comic Sans MS"/>
+                <w:color w:val="9FB0C6"/>
+                <w:sz w:val="24"/>
+                <w:szCs w:val="24"/>
+              </w:rPr>
+              <w:t xml:space="preserve">	</w:t>
+            </w:r>
+          </w:p>
+          <w:p>
+            <w:pPr>
+              <w:tabs>
+                <w:tab w:val="right" w:pos="3640" w:leader="underscore"/>
+              </w:tabs>
+              <w:spacing w:before="250"/>
+            </w:pPr>
+            <w:r>
+              <w:rPr>
+                <w:rFonts w:ascii="Comic Sans MS" w:cs="Comic Sans MS" w:eastAsia="Comic Sans MS" w:hAnsi="Comic Sans MS"/>
+                <w:color w:val="9FB0C6"/>
+                <w:sz w:val="24"/>
+                <w:szCs w:val="24"/>
+              </w:rPr>
+              <w:t xml:space="preserve">	</w:t>
+            </w:r>
+          </w:p>
+          <w:p>
+            <w:pPr>
+              <w:tabs>
+                <w:tab w:val="right" w:pos="3640" w:leader="underscore"/>
+              </w:tabs>
+              <w:spacing w:before="250"/>
+            </w:pPr>
+            <w:r>
+              <w:rPr>
+                <w:rFonts w:ascii="Comic Sans MS" w:cs="Comic Sans MS" w:eastAsia="Comic Sans MS" w:hAnsi="Comic Sans MS"/>
+                <w:color w:val="9FB0C6"/>
+                <w:sz w:val="24"/>
+                <w:szCs w:val="24"/>
+              </w:rPr>
+              <w:t xml:space="preserve">	</w:t>
+            </w:r>
+          </w:p>
+        </w:tc>
+        <w:tc>
+          <w:tcPr>
+            <w:vMerge w:val="continue"/>
+            <w:tcBorders>
+              <w:top w:val="none" w:color="FFFFFF" w:sz="0"/>
+              <w:left w:val="none" w:color="FFFFFF" w:sz="0"/>
+              <w:bottom w:val="none" w:color="FFFFFF" w:sz="0"/>
+              <w:right w:val="none" w:color="FFFFFF" w:sz="0"/>
+            </w:tcBorders>
+          </w:tcPr>
           <w:p/>
         </w:tc>
         <w:tc>
           <w:tcPr>
-            <w:tcW w:type="dxa" w:w="5316"/>
+            <w:tcW w:type="dxa" w:w="3900"/>
             <w:tcBorders>
-              <w:top w:val="single" w:color="1F4E9E" w:sz="12"/>
-              <w:left w:val="single" w:color="1F4E9E" w:sz="12"/>
-              <w:bottom w:val="single" w:color="1F4E9E" w:sz="12"/>
-              <w:right w:val="single" w:color="1F4E9E" w:sz="12"/>
+              <w:top w:val="none" w:color="FFFFFF" w:sz="0"/>
+              <w:left w:val="none" w:color="FFFFFF" w:sz="0"/>
+              <w:bottom w:val="none" w:color="FFFFFF" w:sz="0"/>
+              <w:right w:val="none" w:color="FFFFFF" w:sz="0"/>
             </w:tcBorders>
             <w:tcMar>
-              <w:top w:type="dxa" w:w="120"/>
-              <w:left w:type="dxa" w:w="160"/>
-              <w:bottom w:type="dxa" w:w="120"/>
-              <w:right w:type="dxa" w:w="160"/>
+              <w:top w:type="dxa" w:w="60"/>
+              <w:left w:type="dxa" w:w="80"/>
+              <w:right w:type="dxa" w:w="80"/>
             </w:tcMar>
           </w:tcPr>
           <w:p>
             <w:pPr>
-              <w:shd w:fill="DCE6F5" w:color="auto" w:val="clear"/>
-              <w:spacing w:after="160"/>
+              <w:spacing w:after="60"/>
               <w:jc w:val="center"/>
             </w:pPr>
             <w:r>
-              <w:rPr>
-                <w:rFonts w:ascii="Comic Sans MS" w:cs="Comic Sans MS" w:eastAsia="Comic Sans MS" w:hAnsi="Comic Sans MS"/>
-                <w:b/>
-                <w:bCs/>
-                <w:color w:val="1F4E9E"/>
+              <w:drawing>
+                <wp:inline distT="0" distB="0" distL="0" distR="0">
+                  <wp:extent cx="2381250" cy="819150"/>
+                  <wp:effectExtent t="0" r="0" b="0" l="0"/>
+                  <wp:docPr id="1" name="" descr="" title=""/>
+                  <wp:cNvGraphicFramePr>
+                    <a:graphicFrameLocks xmlns:a="http://schemas.openxmlformats.org/drawingml/2006/main" noChangeAspect="1"/>
+                  </wp:cNvGraphicFramePr>
+                  <a:graphic xmlns:a="http://schemas.openxmlformats.org/drawingml/2006/main">
+                    <a:graphicData uri="http://schemas.openxmlformats.org/drawingml/2006/picture">
+                      <pic:pic xmlns:pic="http://schemas.openxmlformats.org/drawingml/2006/picture">
+                        <pic:nvPicPr>
+                          <pic:cNvPr id="0" name="" descr=""/>
+                          <pic:cNvPicPr>
+                            <a:picLocks noChangeAspect="1" noChangeArrowheads="1"/>
+                          </pic:cNvPicPr>
+                        </pic:nvPicPr>
+                        <pic:blipFill>
+                          <a:blip r:embed="rId11" cstate="none"/>
+                          <a:srcRect/>
+                          <a:stretch>
+                            <a:fillRect/>
+                          </a:stretch>
+                        </pic:blipFill>
+                        <pic:spPr bwMode="auto">
+                          <a:xfrm>
+                            <a:off x="0" y="0"/>
+                            <a:ext cx="2381250" cy="819150"/>
+                          </a:xfrm>
+                          <a:prstGeom prst="rect">
+                            <a:avLst/>
+                          </a:prstGeom>
+                        </pic:spPr>
+                      </pic:pic>
+                    </a:graphicData>
+                  </a:graphic>
+                </wp:inline>
+              </w:drawing>
+            </w:r>
+          </w:p>
+          <w:p>
+            <w:pPr>
+              <w:tabs>
+                <w:tab w:val="right" w:pos="3640" w:leader="underscore"/>
+              </w:tabs>
+              <w:spacing w:before="250"/>
+            </w:pPr>
+            <w:r>
+              <w:rPr>
+                <w:rFonts w:ascii="Comic Sans MS" w:cs="Comic Sans MS" w:eastAsia="Comic Sans MS" w:hAnsi="Comic Sans MS"/>
+                <w:color w:val="9FB0C6"/>
                 <w:sz w:val="24"/>
                 <w:szCs w:val="24"/>
               </w:rPr>
-              <w:t xml:space="preserve">Arbeitsort</w:t>
-            </w:r>
-          </w:p>
-          <w:p/>
+              <w:t xml:space="preserve">	</w:t>
+            </w:r>
+          </w:p>
+          <w:p>
+            <w:pPr>
+              <w:tabs>
+                <w:tab w:val="right" w:pos="3640" w:leader="underscore"/>
+              </w:tabs>
+              <w:spacing w:before="250"/>
+            </w:pPr>
+            <w:r>
+              <w:rPr>
+                <w:rFonts w:ascii="Comic Sans MS" w:cs="Comic Sans MS" w:eastAsia="Comic Sans MS" w:hAnsi="Comic Sans MS"/>
+                <w:color w:val="9FB0C6"/>
+                <w:sz w:val="24"/>
+                <w:szCs w:val="24"/>
+              </w:rPr>
+              <w:t xml:space="preserve">	</w:t>
+            </w:r>
+          </w:p>
+          <w:p>
+            <w:pPr>
+              <w:tabs>
+                <w:tab w:val="right" w:pos="3640" w:leader="underscore"/>
+              </w:tabs>
+              <w:spacing w:before="250"/>
+            </w:pPr>
+            <w:r>
+              <w:rPr>
+                <w:rFonts w:ascii="Comic Sans MS" w:cs="Comic Sans MS" w:eastAsia="Comic Sans MS" w:hAnsi="Comic Sans MS"/>
+                <w:color w:val="9FB0C6"/>
+                <w:sz w:val="24"/>
+                <w:szCs w:val="24"/>
+              </w:rPr>
+              <w:t xml:space="preserve">	</w:t>
+            </w:r>
+          </w:p>
+          <w:p>
+            <w:pPr>
+              <w:tabs>
+                <w:tab w:val="right" w:pos="3640" w:leader="underscore"/>
+              </w:tabs>
+              <w:spacing w:before="250"/>
+            </w:pPr>
+            <w:r>
+              <w:rPr>
+                <w:rFonts w:ascii="Comic Sans MS" w:cs="Comic Sans MS" w:eastAsia="Comic Sans MS" w:hAnsi="Comic Sans MS"/>
+                <w:color w:val="9FB0C6"/>
+                <w:sz w:val="24"/>
+                <w:szCs w:val="24"/>
+              </w:rPr>
+              <w:t xml:space="preserve">	</w:t>
+            </w:r>
+          </w:p>
+          <w:p>
+            <w:pPr>
+              <w:tabs>
+                <w:tab w:val="right" w:pos="3640" w:leader="underscore"/>
+              </w:tabs>
+              <w:spacing w:before="250"/>
+            </w:pPr>
+            <w:r>
+              <w:rPr>
+                <w:rFonts w:ascii="Comic Sans MS" w:cs="Comic Sans MS" w:eastAsia="Comic Sans MS" w:hAnsi="Comic Sans MS"/>
+                <w:color w:val="9FB0C6"/>
+                <w:sz w:val="24"/>
+                <w:szCs w:val="24"/>
+              </w:rPr>
+              <w:t xml:space="preserve">	</w:t>
+            </w:r>
+          </w:p>
+          <w:p>
+            <w:pPr>
+              <w:tabs>
+                <w:tab w:val="right" w:pos="3640" w:leader="underscore"/>
+              </w:tabs>
+              <w:spacing w:before="250"/>
+            </w:pPr>
+            <w:r>
+              <w:rPr>
+                <w:rFonts w:ascii="Comic Sans MS" w:cs="Comic Sans MS" w:eastAsia="Comic Sans MS" w:hAnsi="Comic Sans MS"/>
+                <w:color w:val="9FB0C6"/>
+                <w:sz w:val="24"/>
+                <w:szCs w:val="24"/>
+              </w:rPr>
+              <w:t xml:space="preserve">	</w:t>
+            </w:r>
+          </w:p>
         </w:tc>
       </w:tr>
       <w:tr>
         <w:trPr>
-          <w:trHeight w:val="4100" w:hRule="atLeast"/>
+          <w:cantSplit/>
+          <w:trHeight w:val="4600" w:hRule="atLeast"/>
         </w:trPr>
         <w:tc>
           <w:tcPr>
-            <w:tcW w:type="dxa" w:w="5316"/>
+            <w:tcW w:type="dxa" w:w="3900"/>
             <w:tcBorders>
-              <w:top w:val="single" w:color="1F4E9E" w:sz="12"/>
-              <w:left w:val="single" w:color="1F4E9E" w:sz="12"/>
-              <w:bottom w:val="single" w:color="1F4E9E" w:sz="12"/>
-              <w:right w:val="single" w:color="1F4E9E" w:sz="12"/>
+              <w:top w:val="none" w:color="FFFFFF" w:sz="0"/>
+              <w:left w:val="none" w:color="FFFFFF" w:sz="0"/>
+              <w:bottom w:val="none" w:color="FFFFFF" w:sz="0"/>
+              <w:right w:val="none" w:color="FFFFFF" w:sz="0"/>
             </w:tcBorders>
             <w:tcMar>
-              <w:top w:type="dxa" w:w="120"/>
-              <w:left w:type="dxa" w:w="160"/>
-              <w:bottom w:type="dxa" w:w="120"/>
-              <w:right w:type="dxa" w:w="160"/>
+              <w:top w:type="dxa" w:w="60"/>
+              <w:left w:type="dxa" w:w="80"/>
+              <w:right w:type="dxa" w:w="80"/>
             </w:tcMar>
           </w:tcPr>
           <w:p>
             <w:pPr>
-              <w:shd w:fill="DCE6F5" w:color="auto" w:val="clear"/>
-              <w:spacing w:after="160"/>
+              <w:spacing w:after="60"/>
               <w:jc w:val="center"/>
             </w:pPr>
             <w:r>
-              <w:rPr>
-                <w:rFonts w:ascii="Comic Sans MS" w:cs="Comic Sans MS" w:eastAsia="Comic Sans MS" w:hAnsi="Comic Sans MS"/>
-                <w:b/>
-                <w:bCs/>
-                <w:color w:val="1F4E9E"/>
+              <w:drawing>
+                <wp:inline distT="0" distB="0" distL="0" distR="0">
+                  <wp:extent cx="2381250" cy="819150"/>
+                  <wp:effectExtent t="0" r="0" b="0" l="0"/>
+                  <wp:docPr id="1" name="" descr="" title=""/>
+                  <wp:cNvGraphicFramePr>
+                    <a:graphicFrameLocks xmlns:a="http://schemas.openxmlformats.org/drawingml/2006/main" noChangeAspect="1"/>
+                  </wp:cNvGraphicFramePr>
+                  <a:graphic xmlns:a="http://schemas.openxmlformats.org/drawingml/2006/main">
+                    <a:graphicData uri="http://schemas.openxmlformats.org/drawingml/2006/picture">
+                      <pic:pic xmlns:pic="http://schemas.openxmlformats.org/drawingml/2006/picture">
+                        <pic:nvPicPr>
+                          <pic:cNvPr id="0" name="" descr=""/>
+                          <pic:cNvPicPr>
+                            <a:picLocks noChangeAspect="1" noChangeArrowheads="1"/>
+                          </pic:cNvPicPr>
+                        </pic:nvPicPr>
+                        <pic:blipFill>
+                          <a:blip r:embed="rId12" cstate="none"/>
+                          <a:srcRect/>
+                          <a:stretch>
+                            <a:fillRect/>
+                          </a:stretch>
+                        </pic:blipFill>
+                        <pic:spPr bwMode="auto">
+                          <a:xfrm>
+                            <a:off x="0" y="0"/>
+                            <a:ext cx="2381250" cy="819150"/>
+                          </a:xfrm>
+                          <a:prstGeom prst="rect">
+                            <a:avLst/>
+                          </a:prstGeom>
+                        </pic:spPr>
+                      </pic:pic>
+                    </a:graphicData>
+                  </a:graphic>
+                </wp:inline>
+              </w:drawing>
+            </w:r>
+          </w:p>
+          <w:p>
+            <w:pPr>
+              <w:tabs>
+                <w:tab w:val="right" w:pos="3640" w:leader="underscore"/>
+              </w:tabs>
+              <w:spacing w:before="250"/>
+            </w:pPr>
+            <w:r>
+              <w:rPr>
+                <w:rFonts w:ascii="Comic Sans MS" w:cs="Comic Sans MS" w:eastAsia="Comic Sans MS" w:hAnsi="Comic Sans MS"/>
+                <w:color w:val="9FB0C6"/>
                 <w:sz w:val="24"/>
                 <w:szCs w:val="24"/>
               </w:rPr>
-              <w:t xml:space="preserve">Arbeitsmittel / Arbeitsmaterial</w:t>
-            </w:r>
-          </w:p>
+              <w:t xml:space="preserve">	</w:t>
+            </w:r>
+          </w:p>
+          <w:p>
+            <w:pPr>
+              <w:tabs>
+                <w:tab w:val="right" w:pos="3640" w:leader="underscore"/>
+              </w:tabs>
+              <w:spacing w:before="250"/>
+            </w:pPr>
+            <w:r>
+              <w:rPr>
+                <w:rFonts w:ascii="Comic Sans MS" w:cs="Comic Sans MS" w:eastAsia="Comic Sans MS" w:hAnsi="Comic Sans MS"/>
+                <w:color w:val="9FB0C6"/>
+                <w:sz w:val="24"/>
+                <w:szCs w:val="24"/>
+              </w:rPr>
+              <w:t xml:space="preserve">	</w:t>
+            </w:r>
+          </w:p>
+          <w:p>
+            <w:pPr>
+              <w:tabs>
+                <w:tab w:val="right" w:pos="3640" w:leader="underscore"/>
+              </w:tabs>
+              <w:spacing w:before="250"/>
+            </w:pPr>
+            <w:r>
+              <w:rPr>
+                <w:rFonts w:ascii="Comic Sans MS" w:cs="Comic Sans MS" w:eastAsia="Comic Sans MS" w:hAnsi="Comic Sans MS"/>
+                <w:color w:val="9FB0C6"/>
+                <w:sz w:val="24"/>
+                <w:szCs w:val="24"/>
+              </w:rPr>
+              <w:t xml:space="preserve">	</w:t>
+            </w:r>
+          </w:p>
+          <w:p>
+            <w:pPr>
+              <w:tabs>
+                <w:tab w:val="right" w:pos="3640" w:leader="underscore"/>
+              </w:tabs>
+              <w:spacing w:before="250"/>
+            </w:pPr>
+            <w:r>
+              <w:rPr>
+                <w:rFonts w:ascii="Comic Sans MS" w:cs="Comic Sans MS" w:eastAsia="Comic Sans MS" w:hAnsi="Comic Sans MS"/>
+                <w:color w:val="9FB0C6"/>
+                <w:sz w:val="24"/>
+                <w:szCs w:val="24"/>
+              </w:rPr>
+              <w:t xml:space="preserve">	</w:t>
+            </w:r>
+          </w:p>
+          <w:p>
+            <w:pPr>
+              <w:tabs>
+                <w:tab w:val="right" w:pos="3640" w:leader="underscore"/>
+              </w:tabs>
+              <w:spacing w:before="250"/>
+            </w:pPr>
+            <w:r>
+              <w:rPr>
+                <w:rFonts w:ascii="Comic Sans MS" w:cs="Comic Sans MS" w:eastAsia="Comic Sans MS" w:hAnsi="Comic Sans MS"/>
+                <w:color w:val="9FB0C6"/>
+                <w:sz w:val="24"/>
+                <w:szCs w:val="24"/>
+              </w:rPr>
+              <w:t xml:space="preserve">	</w:t>
+            </w:r>
+          </w:p>
+          <w:p>
+            <w:pPr>
+              <w:tabs>
+                <w:tab w:val="right" w:pos="3640" w:leader="underscore"/>
+              </w:tabs>
+              <w:spacing w:before="250"/>
+            </w:pPr>
+            <w:r>
+              <w:rPr>
+                <w:rFonts w:ascii="Comic Sans MS" w:cs="Comic Sans MS" w:eastAsia="Comic Sans MS" w:hAnsi="Comic Sans MS"/>
+                <w:color w:val="9FB0C6"/>
+                <w:sz w:val="24"/>
+                <w:szCs w:val="24"/>
+              </w:rPr>
+              <w:t xml:space="preserve">	</w:t>
+            </w:r>
+          </w:p>
+        </w:tc>
+        <w:tc>
+          <w:tcPr>
+            <w:vMerge w:val="continue"/>
+            <w:tcBorders>
+              <w:top w:val="none" w:color="FFFFFF" w:sz="0"/>
+              <w:left w:val="none" w:color="FFFFFF" w:sz="0"/>
+              <w:bottom w:val="none" w:color="FFFFFF" w:sz="0"/>
+              <w:right w:val="none" w:color="FFFFFF" w:sz="0"/>
+            </w:tcBorders>
+          </w:tcPr>
           <w:p/>
         </w:tc>
         <w:tc>
           <w:tcPr>
-            <w:tcW w:type="dxa" w:w="5316"/>
+            <w:tcW w:type="dxa" w:w="3900"/>
             <w:tcBorders>
-              <w:top w:val="single" w:color="1F4E9E" w:sz="12"/>
-              <w:left w:val="single" w:color="1F4E9E" w:sz="12"/>
-              <w:bottom w:val="single" w:color="1F4E9E" w:sz="12"/>
-              <w:right w:val="single" w:color="1F4E9E" w:sz="12"/>
+              <w:top w:val="none" w:color="FFFFFF" w:sz="0"/>
+              <w:left w:val="none" w:color="FFFFFF" w:sz="0"/>
+              <w:bottom w:val="none" w:color="FFFFFF" w:sz="0"/>
+              <w:right w:val="none" w:color="FFFFFF" w:sz="0"/>
             </w:tcBorders>
             <w:tcMar>
-              <w:top w:type="dxa" w:w="120"/>
-              <w:left w:type="dxa" w:w="160"/>
-              <w:bottom w:type="dxa" w:w="120"/>
-              <w:right w:type="dxa" w:w="160"/>
+              <w:top w:type="dxa" w:w="60"/>
+              <w:left w:type="dxa" w:w="80"/>
+              <w:right w:type="dxa" w:w="80"/>
             </w:tcMar>
           </w:tcPr>
           <w:p>
             <w:pPr>
-              <w:shd w:fill="DCE6F5" w:color="auto" w:val="clear"/>
-              <w:spacing w:after="160"/>
+              <w:spacing w:after="60"/>
               <w:jc w:val="center"/>
             </w:pPr>
             <w:r>
-              <w:rPr>
-                <w:rFonts w:ascii="Comic Sans MS" w:cs="Comic Sans MS" w:eastAsia="Comic Sans MS" w:hAnsi="Comic Sans MS"/>
-                <w:b/>
-                <w:bCs/>
-                <w:color w:val="1F4E9E"/>
+              <w:drawing>
+                <wp:inline distT="0" distB="0" distL="0" distR="0">
+                  <wp:extent cx="2381250" cy="819150"/>
+                  <wp:effectExtent t="0" r="0" b="0" l="0"/>
+                  <wp:docPr id="1" name="" descr="" title=""/>
+                  <wp:cNvGraphicFramePr>
+                    <a:graphicFrameLocks xmlns:a="http://schemas.openxmlformats.org/drawingml/2006/main" noChangeAspect="1"/>
+                  </wp:cNvGraphicFramePr>
+                  <a:graphic xmlns:a="http://schemas.openxmlformats.org/drawingml/2006/main">
+                    <a:graphicData uri="http://schemas.openxmlformats.org/drawingml/2006/picture">
+                      <pic:pic xmlns:pic="http://schemas.openxmlformats.org/drawingml/2006/picture">
+                        <pic:nvPicPr>
+                          <pic:cNvPr id="0" name="" descr=""/>
+                          <pic:cNvPicPr>
+                            <a:picLocks noChangeAspect="1" noChangeArrowheads="1"/>
+                          </pic:cNvPicPr>
+                        </pic:nvPicPr>
+                        <pic:blipFill>
+                          <a:blip r:embed="rId13" cstate="none"/>
+                          <a:srcRect/>
+                          <a:stretch>
+                            <a:fillRect/>
+                          </a:stretch>
+                        </pic:blipFill>
+                        <pic:spPr bwMode="auto">
+                          <a:xfrm>
+                            <a:off x="0" y="0"/>
+                            <a:ext cx="2381250" cy="819150"/>
+                          </a:xfrm>
+                          <a:prstGeom prst="rect">
+                            <a:avLst/>
+                          </a:prstGeom>
+                        </pic:spPr>
+                      </pic:pic>
+                    </a:graphicData>
+                  </a:graphic>
+                </wp:inline>
+              </w:drawing>
+            </w:r>
+          </w:p>
+          <w:p>
+            <w:pPr>
+              <w:tabs>
+                <w:tab w:val="right" w:pos="3640" w:leader="underscore"/>
+              </w:tabs>
+              <w:spacing w:before="250"/>
+            </w:pPr>
+            <w:r>
+              <w:rPr>
+                <w:rFonts w:ascii="Comic Sans MS" w:cs="Comic Sans MS" w:eastAsia="Comic Sans MS" w:hAnsi="Comic Sans MS"/>
+                <w:color w:val="9FB0C6"/>
                 <w:sz w:val="24"/>
                 <w:szCs w:val="24"/>
               </w:rPr>
-              <w:t xml:space="preserve">Arbeitsbedingungen</w:t>
-            </w:r>
-          </w:p>
-          <w:p/>
-        </w:tc>
-      </w:tr>
-      <w:tr>
-        <w:trPr>
-          <w:trHeight w:val="4100" w:hRule="atLeast"/>
-        </w:trPr>
-        <w:tc>
-          <w:tcPr>
-            <w:tcW w:type="dxa" w:w="5316"/>
-            <w:tcBorders>
-              <w:top w:val="single" w:color="1F4E9E" w:sz="12"/>
-              <w:left w:val="single" w:color="1F4E9E" w:sz="12"/>
-              <w:bottom w:val="single" w:color="1F4E9E" w:sz="12"/>
-              <w:right w:val="single" w:color="1F4E9E" w:sz="12"/>
-            </w:tcBorders>
-            <w:tcMar>
-              <w:top w:type="dxa" w:w="120"/>
-              <w:left w:type="dxa" w:w="160"/>
-              <w:bottom w:type="dxa" w:w="120"/>
-              <w:right w:type="dxa" w:w="160"/>
-            </w:tcMar>
-          </w:tcPr>
-          <w:p>
-            <w:pPr>
-              <w:shd w:fill="DCE6F5" w:color="auto" w:val="clear"/>
-              <w:spacing w:after="160"/>
-              <w:jc w:val="center"/>
-            </w:pPr>
-            <w:r>
-              <w:rPr>
-                <w:rFonts w:ascii="Comic Sans MS" w:cs="Comic Sans MS" w:eastAsia="Comic Sans MS" w:hAnsi="Comic Sans MS"/>
-                <w:b/>
-                <w:bCs/>
-                <w:color w:val="1F4E9E"/>
+              <w:t xml:space="preserve">	</w:t>
+            </w:r>
+          </w:p>
+          <w:p>
+            <w:pPr>
+              <w:tabs>
+                <w:tab w:val="right" w:pos="3640" w:leader="underscore"/>
+              </w:tabs>
+              <w:spacing w:before="250"/>
+            </w:pPr>
+            <w:r>
+              <w:rPr>
+                <w:rFonts w:ascii="Comic Sans MS" w:cs="Comic Sans MS" w:eastAsia="Comic Sans MS" w:hAnsi="Comic Sans MS"/>
+                <w:color w:val="9FB0C6"/>
                 <w:sz w:val="24"/>
                 <w:szCs w:val="24"/>
               </w:rPr>
-              <w:t xml:space="preserve">Anforderungen / Fähigkeiten</w:t>
-            </w:r>
-          </w:p>
-          <w:p/>
-        </w:tc>
-        <w:tc>
-          <w:tcPr>
-            <w:tcW w:type="dxa" w:w="5316"/>
-            <w:tcBorders>
-              <w:top w:val="single" w:color="1F4E9E" w:sz="12"/>
-              <w:left w:val="single" w:color="1F4E9E" w:sz="12"/>
-              <w:bottom w:val="single" w:color="1F4E9E" w:sz="12"/>
-              <w:right w:val="single" w:color="1F4E9E" w:sz="12"/>
-            </w:tcBorders>
-            <w:tcMar>
-              <w:top w:type="dxa" w:w="120"/>
-              <w:left w:type="dxa" w:w="160"/>
-              <w:bottom w:type="dxa" w:w="120"/>
-              <w:right w:type="dxa" w:w="160"/>
-            </w:tcMar>
-          </w:tcPr>
-          <w:p>
-            <w:pPr>
-              <w:shd w:fill="DCE6F5" w:color="auto" w:val="clear"/>
-              <w:spacing w:after="160"/>
-              <w:jc w:val="center"/>
-            </w:pPr>
-            <w:r>
-              <w:rPr>
-                <w:rFonts w:ascii="Comic Sans MS" w:cs="Comic Sans MS" w:eastAsia="Comic Sans MS" w:hAnsi="Comic Sans MS"/>
-                <w:b/>
-                <w:bCs/>
-                <w:color w:val="1F4E9E"/>
+              <w:t xml:space="preserve">	</w:t>
+            </w:r>
+          </w:p>
+          <w:p>
+            <w:pPr>
+              <w:tabs>
+                <w:tab w:val="right" w:pos="3640" w:leader="underscore"/>
+              </w:tabs>
+              <w:spacing w:before="250"/>
+            </w:pPr>
+            <w:r>
+              <w:rPr>
+                <w:rFonts w:ascii="Comic Sans MS" w:cs="Comic Sans MS" w:eastAsia="Comic Sans MS" w:hAnsi="Comic Sans MS"/>
+                <w:color w:val="9FB0C6"/>
                 <w:sz w:val="24"/>
                 <w:szCs w:val="24"/>
               </w:rPr>
-              <w:t xml:space="preserve">Gründe für die Berufswahl</w:t>
-            </w:r>
-          </w:p>
-          <w:p/>
+              <w:t xml:space="preserve">	</w:t>
+            </w:r>
+          </w:p>
+          <w:p>
+            <w:pPr>
+              <w:tabs>
+                <w:tab w:val="right" w:pos="3640" w:leader="underscore"/>
+              </w:tabs>
+              <w:spacing w:before="250"/>
+            </w:pPr>
+            <w:r>
+              <w:rPr>
+                <w:rFonts w:ascii="Comic Sans MS" w:cs="Comic Sans MS" w:eastAsia="Comic Sans MS" w:hAnsi="Comic Sans MS"/>
+                <w:color w:val="9FB0C6"/>
+                <w:sz w:val="24"/>
+                <w:szCs w:val="24"/>
+              </w:rPr>
+              <w:t xml:space="preserve">	</w:t>
+            </w:r>
+          </w:p>
+          <w:p>
+            <w:pPr>
+              <w:tabs>
+                <w:tab w:val="right" w:pos="3640" w:leader="underscore"/>
+              </w:tabs>
+              <w:spacing w:before="250"/>
+            </w:pPr>
+            <w:r>
+              <w:rPr>
+                <w:rFonts w:ascii="Comic Sans MS" w:cs="Comic Sans MS" w:eastAsia="Comic Sans MS" w:hAnsi="Comic Sans MS"/>
+                <w:color w:val="9FB0C6"/>
+                <w:sz w:val="24"/>
+                <w:szCs w:val="24"/>
+              </w:rPr>
+              <w:t xml:space="preserve">	</w:t>
+            </w:r>
+          </w:p>
+          <w:p>
+            <w:pPr>
+              <w:tabs>
+                <w:tab w:val="right" w:pos="3640" w:leader="underscore"/>
+              </w:tabs>
+              <w:spacing w:before="250"/>
+            </w:pPr>
+            <w:r>
+              <w:rPr>
+                <w:rFonts w:ascii="Comic Sans MS" w:cs="Comic Sans MS" w:eastAsia="Comic Sans MS" w:hAnsi="Comic Sans MS"/>
+                <w:color w:val="9FB0C6"/>
+                <w:sz w:val="24"/>
+                <w:szCs w:val="24"/>
+              </w:rPr>
+              <w:t xml:space="preserve">	</w:t>
+            </w:r>
+          </w:p>
         </w:tc>
       </w:tr>
     </w:tbl>
@@ -1352,54 +2206,83 @@
       <w:tblPr>
         <w:tblW w:type="dxa" w:w="10632"/>
         <w:tblBorders>
-          <w:top w:val="single" w:color="auto" w:sz="4"/>
-          <w:left w:val="single" w:color="auto" w:sz="4"/>
-          <w:bottom w:val="single" w:color="auto" w:sz="4"/>
-          <w:right w:val="single" w:color="auto" w:sz="4"/>
-          <w:insideH w:val="single" w:color="auto" w:sz="4"/>
-          <w:insideV w:val="single" w:color="auto" w:sz="4"/>
+          <w:top w:val="none" w:color="FFFFFF" w:sz="0"/>
+          <w:left w:val="none" w:color="FFFFFF" w:sz="0"/>
+          <w:bottom w:val="none" w:color="FFFFFF" w:sz="0"/>
+          <w:right w:val="none" w:color="FFFFFF" w:sz="0"/>
+          <w:insideH w:val="none" w:color="FFFFFF" w:sz="0"/>
+          <w:insideV w:val="none" w:color="FFFFFF" w:sz="0"/>
         </w:tblBorders>
       </w:tblPr>
       <w:tblGrid>
-        <w:gridCol w:w="5316"/>
-        <w:gridCol w:w="5316"/>
+        <w:gridCol w:w="3900"/>
+        <w:gridCol w:w="2832"/>
+        <w:gridCol w:w="3900"/>
       </w:tblGrid>
       <w:tr>
         <w:trPr>
-          <w:trHeight w:val="2600" w:hRule="atLeast"/>
+          <w:cantSplit/>
+          <w:trHeight w:val="4300" w:hRule="atLeast"/>
         </w:trPr>
         <w:tc>
           <w:tcPr>
-            <w:tcW w:type="dxa" w:w="5316"/>
+            <w:tcW w:type="dxa" w:w="3900"/>
             <w:tcBorders>
-              <w:top w:val="single" w:color="1F4E9E" w:sz="12"/>
-              <w:left w:val="single" w:color="1F4E9E" w:sz="12"/>
-              <w:bottom w:val="single" w:color="1F4E9E" w:sz="12"/>
-              <w:right w:val="single" w:color="1F4E9E" w:sz="12"/>
+              <w:top w:val="none" w:color="FFFFFF" w:sz="0"/>
+              <w:left w:val="none" w:color="FFFFFF" w:sz="0"/>
+              <w:bottom w:val="none" w:color="FFFFFF" w:sz="0"/>
+              <w:right w:val="none" w:color="FFFFFF" w:sz="0"/>
             </w:tcBorders>
             <w:tcMar>
-              <w:top w:type="dxa" w:w="120"/>
-              <w:left w:type="dxa" w:w="160"/>
-              <w:bottom w:type="dxa" w:w="120"/>
-              <w:right w:type="dxa" w:w="160"/>
+              <w:top w:type="dxa" w:w="60"/>
+              <w:left w:type="dxa" w:w="80"/>
+              <w:right w:type="dxa" w:w="80"/>
             </w:tcMar>
           </w:tcPr>
           <w:p>
             <w:pPr>
-              <w:shd w:fill="DCE6F5" w:color="auto" w:val="clear"/>
-              <w:spacing w:after="160"/>
+              <w:spacing w:after="60"/>
               <w:jc w:val="center"/>
             </w:pPr>
             <w:r>
-              <w:rPr>
-                <w:rFonts w:ascii="Comic Sans MS" w:cs="Comic Sans MS" w:eastAsia="Comic Sans MS" w:hAnsi="Comic Sans MS"/>
-                <w:b/>
-                <w:bCs/>
-                <w:color w:val="1F4E9E"/>
-                <w:sz w:val="24"/>
-                <w:szCs w:val="24"/>
-              </w:rPr>
-              <w:t xml:space="preserve">Tätigkeiten am Arbeitsplatz</w:t>
+              <w:drawing>
+                <wp:inline distT="0" distB="0" distL="0" distR="0">
+                  <wp:extent cx="2381250" cy="819150"/>
+                  <wp:effectExtent t="0" r="0" b="0" l="0"/>
+                  <wp:docPr id="1" name="" descr="" title=""/>
+                  <wp:cNvGraphicFramePr>
+                    <a:graphicFrameLocks xmlns:a="http://schemas.openxmlformats.org/drawingml/2006/main" noChangeAspect="1"/>
+                  </wp:cNvGraphicFramePr>
+                  <a:graphic xmlns:a="http://schemas.openxmlformats.org/drawingml/2006/main">
+                    <a:graphicData uri="http://schemas.openxmlformats.org/drawingml/2006/picture">
+                      <pic:pic xmlns:pic="http://schemas.openxmlformats.org/drawingml/2006/picture">
+                        <pic:nvPicPr>
+                          <pic:cNvPr id="0" name="" descr=""/>
+                          <pic:cNvPicPr>
+                            <a:picLocks noChangeAspect="1" noChangeArrowheads="1"/>
+                          </pic:cNvPicPr>
+                        </pic:nvPicPr>
+                        <pic:blipFill>
+                          <a:blip r:embed="rId7" cstate="none"/>
+                          <a:srcRect/>
+                          <a:stretch>
+                            <a:fillRect/>
+                          </a:stretch>
+                        </pic:blipFill>
+                        <pic:spPr bwMode="auto">
+                          <a:xfrm>
+                            <a:off x="0" y="0"/>
+                            <a:ext cx="2381250" cy="819150"/>
+                          </a:xfrm>
+                          <a:prstGeom prst="rect">
+                            <a:avLst/>
+                          </a:prstGeom>
+                        </pic:spPr>
+                      </pic:pic>
+                    </a:graphicData>
+                  </a:graphic>
+                </wp:inline>
+              </w:drawing>
             </w:r>
           </w:p>
           <w:p>
@@ -1409,11 +2292,12 @@
                 <w:ilvl w:val="0"/>
                 <w:numId w:val="2"/>
               </w:numPr>
-              <w:spacing w:after="40"/>
-            </w:pPr>
-            <w:r>
-              <w:rPr>
-                <w:rFonts w:ascii="Comic Sans MS" w:cs="Comic Sans MS" w:eastAsia="Comic Sans MS" w:hAnsi="Comic Sans MS"/>
+              <w:spacing w:after="30"/>
+            </w:pPr>
+            <w:r>
+              <w:rPr>
+                <w:rFonts w:ascii="Comic Sans MS" w:cs="Comic Sans MS" w:eastAsia="Comic Sans MS" w:hAnsi="Comic Sans MS"/>
+                <w:color w:val="16243A"/>
                 <w:sz w:val="21"/>
                 <w:szCs w:val="21"/>
               </w:rPr>
@@ -1427,11 +2311,12 @@
                 <w:ilvl w:val="0"/>
                 <w:numId w:val="2"/>
               </w:numPr>
-              <w:spacing w:after="40"/>
-            </w:pPr>
-            <w:r>
-              <w:rPr>
-                <w:rFonts w:ascii="Comic Sans MS" w:cs="Comic Sans MS" w:eastAsia="Comic Sans MS" w:hAnsi="Comic Sans MS"/>
+              <w:spacing w:after="30"/>
+            </w:pPr>
+            <w:r>
+              <w:rPr>
+                <w:rFonts w:ascii="Comic Sans MS" w:cs="Comic Sans MS" w:eastAsia="Comic Sans MS" w:hAnsi="Comic Sans MS"/>
+                <w:color w:val="16243A"/>
                 <w:sz w:val="21"/>
                 <w:szCs w:val="21"/>
               </w:rPr>
@@ -1445,11 +2330,12 @@
                 <w:ilvl w:val="0"/>
                 <w:numId w:val="2"/>
               </w:numPr>
-              <w:spacing w:after="40"/>
-            </w:pPr>
-            <w:r>
-              <w:rPr>
-                <w:rFonts w:ascii="Comic Sans MS" w:cs="Comic Sans MS" w:eastAsia="Comic Sans MS" w:hAnsi="Comic Sans MS"/>
+              <w:spacing w:after="30"/>
+            </w:pPr>
+            <w:r>
+              <w:rPr>
+                <w:rFonts w:ascii="Comic Sans MS" w:cs="Comic Sans MS" w:eastAsia="Comic Sans MS" w:hAnsi="Comic Sans MS"/>
+                <w:color w:val="16243A"/>
                 <w:sz w:val="21"/>
                 <w:szCs w:val="21"/>
               </w:rPr>
@@ -1463,11 +2349,12 @@
                 <w:ilvl w:val="0"/>
                 <w:numId w:val="2"/>
               </w:numPr>
-              <w:spacing w:after="40"/>
-            </w:pPr>
-            <w:r>
-              <w:rPr>
-                <w:rFonts w:ascii="Comic Sans MS" w:cs="Comic Sans MS" w:eastAsia="Comic Sans MS" w:hAnsi="Comic Sans MS"/>
+              <w:spacing w:after="30"/>
+            </w:pPr>
+            <w:r>
+              <w:rPr>
+                <w:rFonts w:ascii="Comic Sans MS" w:cs="Comic Sans MS" w:eastAsia="Comic Sans MS" w:hAnsi="Comic Sans MS"/>
+                <w:color w:val="16243A"/>
                 <w:sz w:val="21"/>
                 <w:szCs w:val="21"/>
               </w:rPr>
@@ -1481,11 +2368,12 @@
                 <w:ilvl w:val="0"/>
                 <w:numId w:val="2"/>
               </w:numPr>
-              <w:spacing w:after="40"/>
-            </w:pPr>
-            <w:r>
-              <w:rPr>
-                <w:rFonts w:ascii="Comic Sans MS" w:cs="Comic Sans MS" w:eastAsia="Comic Sans MS" w:hAnsi="Comic Sans MS"/>
+              <w:spacing w:after="30"/>
+            </w:pPr>
+            <w:r>
+              <w:rPr>
+                <w:rFonts w:ascii="Comic Sans MS" w:cs="Comic Sans MS" w:eastAsia="Comic Sans MS" w:hAnsi="Comic Sans MS"/>
+                <w:color w:val="16243A"/>
                 <w:sz w:val="21"/>
                 <w:szCs w:val="21"/>
               </w:rPr>
@@ -1499,11 +2387,12 @@
                 <w:ilvl w:val="0"/>
                 <w:numId w:val="2"/>
               </w:numPr>
-              <w:spacing w:after="40"/>
-            </w:pPr>
-            <w:r>
-              <w:rPr>
-                <w:rFonts w:ascii="Comic Sans MS" w:cs="Comic Sans MS" w:eastAsia="Comic Sans MS" w:hAnsi="Comic Sans MS"/>
+              <w:spacing w:after="30"/>
+            </w:pPr>
+            <w:r>
+              <w:rPr>
+                <w:rFonts w:ascii="Comic Sans MS" w:cs="Comic Sans MS" w:eastAsia="Comic Sans MS" w:hAnsi="Comic Sans MS"/>
+                <w:color w:val="16243A"/>
                 <w:sz w:val="21"/>
                 <w:szCs w:val="21"/>
               </w:rPr>
@@ -1513,36 +2402,121 @@
         </w:tc>
         <w:tc>
           <w:tcPr>
-            <w:tcW w:type="dxa" w:w="5316"/>
+            <w:tcW w:type="dxa" w:w="2832"/>
+            <w:vMerge w:val="restart"/>
             <w:tcBorders>
-              <w:top w:val="single" w:color="1F4E9E" w:sz="12"/>
-              <w:left w:val="single" w:color="1F4E9E" w:sz="12"/>
-              <w:bottom w:val="single" w:color="1F4E9E" w:sz="12"/>
-              <w:right w:val="single" w:color="1F4E9E" w:sz="12"/>
+              <w:top w:val="none" w:color="FFFFFF" w:sz="0"/>
+              <w:left w:val="none" w:color="FFFFFF" w:sz="0"/>
+              <w:bottom w:val="none" w:color="FFFFFF" w:sz="0"/>
+              <w:right w:val="none" w:color="FFFFFF" w:sz="0"/>
+            </w:tcBorders>
+            <w:vAlign w:val="center"/>
+          </w:tcPr>
+          <w:p>
+            <w:pPr>
+              <w:jc w:val="center"/>
+            </w:pPr>
+            <w:r>
+              <w:drawing>
+                <wp:inline distT="0" distB="0" distL="0" distR="0">
+                  <wp:extent cx="1714500" cy="1895475"/>
+                  <wp:effectExtent t="0" r="0" b="0" l="0"/>
+                  <wp:docPr id="1" name="" descr="" title=""/>
+                  <wp:cNvGraphicFramePr>
+                    <a:graphicFrameLocks xmlns:a="http://schemas.openxmlformats.org/drawingml/2006/main" noChangeAspect="1"/>
+                  </wp:cNvGraphicFramePr>
+                  <a:graphic xmlns:a="http://schemas.openxmlformats.org/drawingml/2006/main">
+                    <a:graphicData uri="http://schemas.openxmlformats.org/drawingml/2006/picture">
+                      <pic:pic xmlns:pic="http://schemas.openxmlformats.org/drawingml/2006/picture">
+                        <pic:nvPicPr>
+                          <pic:cNvPr id="0" name="" descr=""/>
+                          <pic:cNvPicPr>
+                            <a:picLocks noChangeAspect="1" noChangeArrowheads="1"/>
+                          </pic:cNvPicPr>
+                        </pic:nvPicPr>
+                        <pic:blipFill>
+                          <a:blip r:embed="rId8" cstate="none"/>
+                          <a:srcRect/>
+                          <a:stretch>
+                            <a:fillRect/>
+                          </a:stretch>
+                        </pic:blipFill>
+                        <pic:spPr bwMode="auto">
+                          <a:xfrm>
+                            <a:off x="0" y="0"/>
+                            <a:ext cx="1714500" cy="1895475"/>
+                          </a:xfrm>
+                          <a:prstGeom prst="rect">
+                            <a:avLst/>
+                          </a:prstGeom>
+                        </pic:spPr>
+                      </pic:pic>
+                    </a:graphicData>
+                  </a:graphic>
+                </wp:inline>
+              </w:drawing>
+            </w:r>
+          </w:p>
+        </w:tc>
+        <w:tc>
+          <w:tcPr>
+            <w:tcW w:type="dxa" w:w="3900"/>
+            <w:tcBorders>
+              <w:top w:val="none" w:color="FFFFFF" w:sz="0"/>
+              <w:left w:val="none" w:color="FFFFFF" w:sz="0"/>
+              <w:bottom w:val="none" w:color="FFFFFF" w:sz="0"/>
+              <w:right w:val="none" w:color="FFFFFF" w:sz="0"/>
             </w:tcBorders>
             <w:tcMar>
-              <w:top w:type="dxa" w:w="120"/>
-              <w:left w:type="dxa" w:w="160"/>
-              <w:bottom w:type="dxa" w:w="120"/>
-              <w:right w:type="dxa" w:w="160"/>
+              <w:top w:type="dxa" w:w="60"/>
+              <w:left w:type="dxa" w:w="80"/>
+              <w:right w:type="dxa" w:w="80"/>
             </w:tcMar>
           </w:tcPr>
           <w:p>
             <w:pPr>
-              <w:shd w:fill="DCE6F5" w:color="auto" w:val="clear"/>
-              <w:spacing w:after="160"/>
+              <w:spacing w:after="60"/>
               <w:jc w:val="center"/>
             </w:pPr>
             <w:r>
-              <w:rPr>
-                <w:rFonts w:ascii="Comic Sans MS" w:cs="Comic Sans MS" w:eastAsia="Comic Sans MS" w:hAnsi="Comic Sans MS"/>
-                <w:b/>
-                <w:bCs/>
-                <w:color w:val="1F4E9E"/>
-                <w:sz w:val="24"/>
-                <w:szCs w:val="24"/>
-              </w:rPr>
-              <w:t xml:space="preserve">Arbeitsort</w:t>
+              <w:drawing>
+                <wp:inline distT="0" distB="0" distL="0" distR="0">
+                  <wp:extent cx="2381250" cy="819150"/>
+                  <wp:effectExtent t="0" r="0" b="0" l="0"/>
+                  <wp:docPr id="1" name="" descr="" title=""/>
+                  <wp:cNvGraphicFramePr>
+                    <a:graphicFrameLocks xmlns:a="http://schemas.openxmlformats.org/drawingml/2006/main" noChangeAspect="1"/>
+                  </wp:cNvGraphicFramePr>
+                  <a:graphic xmlns:a="http://schemas.openxmlformats.org/drawingml/2006/main">
+                    <a:graphicData uri="http://schemas.openxmlformats.org/drawingml/2006/picture">
+                      <pic:pic xmlns:pic="http://schemas.openxmlformats.org/drawingml/2006/picture">
+                        <pic:nvPicPr>
+                          <pic:cNvPr id="0" name="" descr=""/>
+                          <pic:cNvPicPr>
+                            <a:picLocks noChangeAspect="1" noChangeArrowheads="1"/>
+                          </pic:cNvPicPr>
+                        </pic:nvPicPr>
+                        <pic:blipFill>
+                          <a:blip r:embed="rId9" cstate="none"/>
+                          <a:srcRect/>
+                          <a:stretch>
+                            <a:fillRect/>
+                          </a:stretch>
+                        </pic:blipFill>
+                        <pic:spPr bwMode="auto">
+                          <a:xfrm>
+                            <a:off x="0" y="0"/>
+                            <a:ext cx="2381250" cy="819150"/>
+                          </a:xfrm>
+                          <a:prstGeom prst="rect">
+                            <a:avLst/>
+                          </a:prstGeom>
+                        </pic:spPr>
+                      </pic:pic>
+                    </a:graphicData>
+                  </a:graphic>
+                </wp:inline>
+              </w:drawing>
             </w:r>
           </w:p>
           <w:p>
@@ -1552,15 +2526,16 @@
                 <w:ilvl w:val="0"/>
                 <w:numId w:val="2"/>
               </w:numPr>
-              <w:spacing w:after="40"/>
-            </w:pPr>
-            <w:r>
-              <w:rPr>
-                <w:rFonts w:ascii="Comic Sans MS" w:cs="Comic Sans MS" w:eastAsia="Comic Sans MS" w:hAnsi="Comic Sans MS"/>
+              <w:spacing w:after="30"/>
+            </w:pPr>
+            <w:r>
+              <w:rPr>
+                <w:rFonts w:ascii="Comic Sans MS" w:cs="Comic Sans MS" w:eastAsia="Comic Sans MS" w:hAnsi="Comic Sans MS"/>
+                <w:color w:val="16243A"/>
                 <w:sz w:val="21"/>
                 <w:szCs w:val="21"/>
               </w:rPr>
-              <w:t xml:space="preserve">Autowerkstatt / Autohaus (Werkstatthalle)</w:t>
+              <w:t xml:space="preserve">Autowerkstatt / Autohaus</w:t>
             </w:r>
           </w:p>
           <w:p>
@@ -1570,55 +2545,16 @@
                 <w:ilvl w:val="0"/>
                 <w:numId w:val="2"/>
               </w:numPr>
-              <w:spacing w:after="40"/>
-            </w:pPr>
-            <w:r>
-              <w:rPr>
-                <w:rFonts w:ascii="Comic Sans MS" w:cs="Comic Sans MS" w:eastAsia="Comic Sans MS" w:hAnsi="Comic Sans MS"/>
+              <w:spacing w:after="30"/>
+            </w:pPr>
+            <w:r>
+              <w:rPr>
+                <w:rFonts w:ascii="Comic Sans MS" w:cs="Comic Sans MS" w:eastAsia="Comic Sans MS" w:hAnsi="Comic Sans MS"/>
+                <w:color w:val="16243A"/>
                 <w:sz w:val="21"/>
                 <w:szCs w:val="21"/>
               </w:rPr>
-              <w:t xml:space="preserve">Lager</w:t>
-            </w:r>
-          </w:p>
-        </w:tc>
-      </w:tr>
-      <w:tr>
-        <w:trPr>
-          <w:trHeight w:val="2600" w:hRule="atLeast"/>
-        </w:trPr>
-        <w:tc>
-          <w:tcPr>
-            <w:tcW w:type="dxa" w:w="5316"/>
-            <w:tcBorders>
-              <w:top w:val="single" w:color="1F4E9E" w:sz="12"/>
-              <w:left w:val="single" w:color="1F4E9E" w:sz="12"/>
-              <w:bottom w:val="single" w:color="1F4E9E" w:sz="12"/>
-              <w:right w:val="single" w:color="1F4E9E" w:sz="12"/>
-            </w:tcBorders>
-            <w:tcMar>
-              <w:top w:type="dxa" w:w="120"/>
-              <w:left w:type="dxa" w:w="160"/>
-              <w:bottom w:type="dxa" w:w="120"/>
-              <w:right w:type="dxa" w:w="160"/>
-            </w:tcMar>
-          </w:tcPr>
-          <w:p>
-            <w:pPr>
-              <w:shd w:fill="DCE6F5" w:color="auto" w:val="clear"/>
-              <w:spacing w:after="160"/>
-              <w:jc w:val="center"/>
-            </w:pPr>
-            <w:r>
-              <w:rPr>
-                <w:rFonts w:ascii="Comic Sans MS" w:cs="Comic Sans MS" w:eastAsia="Comic Sans MS" w:hAnsi="Comic Sans MS"/>
-                <w:b/>
-                <w:bCs/>
-                <w:color w:val="1F4E9E"/>
-                <w:sz w:val="24"/>
-                <w:szCs w:val="24"/>
-              </w:rPr>
-              <w:t xml:space="preserve">Arbeitsmittel / Arbeitsmaterial</w:t>
+              <w:t xml:space="preserve">Werkstatthalle mit offenem Tor</w:t>
             </w:r>
           </w:p>
           <w:p>
@@ -1628,15 +2564,84 @@
                 <w:ilvl w:val="0"/>
                 <w:numId w:val="2"/>
               </w:numPr>
-              <w:spacing w:after="40"/>
-            </w:pPr>
-            <w:r>
-              <w:rPr>
-                <w:rFonts w:ascii="Comic Sans MS" w:cs="Comic Sans MS" w:eastAsia="Comic Sans MS" w:hAnsi="Comic Sans MS"/>
+              <w:spacing w:after="30"/>
+            </w:pPr>
+            <w:r>
+              <w:rPr>
+                <w:rFonts w:ascii="Comic Sans MS" w:cs="Comic Sans MS" w:eastAsia="Comic Sans MS" w:hAnsi="Comic Sans MS"/>
+                <w:color w:val="16243A"/>
                 <w:sz w:val="21"/>
                 <w:szCs w:val="21"/>
               </w:rPr>
-              <w:t xml:space="preserve">Werkzeug: Schraubenschlüssel, Ratsche, Drehmomentschlüssel</w:t>
+              <w:t xml:space="preserve">Lager für Material</w:t>
+            </w:r>
+          </w:p>
+        </w:tc>
+      </w:tr>
+      <w:tr>
+        <w:trPr>
+          <w:cantSplit/>
+          <w:trHeight w:val="4300" w:hRule="atLeast"/>
+        </w:trPr>
+        <w:tc>
+          <w:tcPr>
+            <w:tcW w:type="dxa" w:w="3900"/>
+            <w:tcBorders>
+              <w:top w:val="none" w:color="FFFFFF" w:sz="0"/>
+              <w:left w:val="none" w:color="FFFFFF" w:sz="0"/>
+              <w:bottom w:val="none" w:color="FFFFFF" w:sz="0"/>
+              <w:right w:val="none" w:color="FFFFFF" w:sz="0"/>
+            </w:tcBorders>
+            <w:tcMar>
+              <w:top w:type="dxa" w:w="60"/>
+              <w:left w:type="dxa" w:w="80"/>
+              <w:right w:type="dxa" w:w="80"/>
+            </w:tcMar>
+          </w:tcPr>
+          <w:p>
+            <w:pPr>
+              <w:spacing w:after="60"/>
+              <w:jc w:val="center"/>
+            </w:pPr>
+            <w:r>
+              <w:drawing>
+                <wp:inline distT="0" distB="0" distL="0" distR="0">
+                  <wp:extent cx="2381250" cy="819150"/>
+                  <wp:effectExtent t="0" r="0" b="0" l="0"/>
+                  <wp:docPr id="1" name="" descr="" title=""/>
+                  <wp:cNvGraphicFramePr>
+                    <a:graphicFrameLocks xmlns:a="http://schemas.openxmlformats.org/drawingml/2006/main" noChangeAspect="1"/>
+                  </wp:cNvGraphicFramePr>
+                  <a:graphic xmlns:a="http://schemas.openxmlformats.org/drawingml/2006/main">
+                    <a:graphicData uri="http://schemas.openxmlformats.org/drawingml/2006/picture">
+                      <pic:pic xmlns:pic="http://schemas.openxmlformats.org/drawingml/2006/picture">
+                        <pic:nvPicPr>
+                          <pic:cNvPr id="0" name="" descr=""/>
+                          <pic:cNvPicPr>
+                            <a:picLocks noChangeAspect="1" noChangeArrowheads="1"/>
+                          </pic:cNvPicPr>
+                        </pic:nvPicPr>
+                        <pic:blipFill>
+                          <a:blip r:embed="rId10" cstate="none"/>
+                          <a:srcRect/>
+                          <a:stretch>
+                            <a:fillRect/>
+                          </a:stretch>
+                        </pic:blipFill>
+                        <pic:spPr bwMode="auto">
+                          <a:xfrm>
+                            <a:off x="0" y="0"/>
+                            <a:ext cx="2381250" cy="819150"/>
+                          </a:xfrm>
+                          <a:prstGeom prst="rect">
+                            <a:avLst/>
+                          </a:prstGeom>
+                        </pic:spPr>
+                      </pic:pic>
+                    </a:graphicData>
+                  </a:graphic>
+                </wp:inline>
+              </w:drawing>
             </w:r>
           </w:p>
           <w:p>
@@ -1646,15 +2651,16 @@
                 <w:ilvl w:val="0"/>
                 <w:numId w:val="2"/>
               </w:numPr>
-              <w:spacing w:after="40"/>
-            </w:pPr>
-            <w:r>
-              <w:rPr>
-                <w:rFonts w:ascii="Comic Sans MS" w:cs="Comic Sans MS" w:eastAsia="Comic Sans MS" w:hAnsi="Comic Sans MS"/>
+              <w:spacing w:after="30"/>
+            </w:pPr>
+            <w:r>
+              <w:rPr>
+                <w:rFonts w:ascii="Comic Sans MS" w:cs="Comic Sans MS" w:eastAsia="Comic Sans MS" w:hAnsi="Comic Sans MS"/>
+                <w:color w:val="16243A"/>
                 <w:sz w:val="21"/>
                 <w:szCs w:val="21"/>
               </w:rPr>
-              <w:t xml:space="preserve">Hebebühne</w:t>
+              <w:t xml:space="preserve">Schraubenschlüssel, Ratsche, Drehmomentschlüssel</w:t>
             </w:r>
           </w:p>
           <w:p>
@@ -1664,15 +2670,16 @@
                 <w:ilvl w:val="0"/>
                 <w:numId w:val="2"/>
               </w:numPr>
-              <w:spacing w:after="40"/>
-            </w:pPr>
-            <w:r>
-              <w:rPr>
-                <w:rFonts w:ascii="Comic Sans MS" w:cs="Comic Sans MS" w:eastAsia="Comic Sans MS" w:hAnsi="Comic Sans MS"/>
+              <w:spacing w:after="30"/>
+            </w:pPr>
+            <w:r>
+              <w:rPr>
+                <w:rFonts w:ascii="Comic Sans MS" w:cs="Comic Sans MS" w:eastAsia="Comic Sans MS" w:hAnsi="Comic Sans MS"/>
+                <w:color w:val="16243A"/>
                 <w:sz w:val="21"/>
                 <w:szCs w:val="21"/>
               </w:rPr>
-              <w:t xml:space="preserve">Diagnose-Computer</w:t>
+              <w:t xml:space="preserve">Hebebühne</w:t>
             </w:r>
           </w:p>
           <w:p>
@@ -1682,15 +2689,16 @@
                 <w:ilvl w:val="0"/>
                 <w:numId w:val="2"/>
               </w:numPr>
-              <w:spacing w:after="40"/>
-            </w:pPr>
-            <w:r>
-              <w:rPr>
-                <w:rFonts w:ascii="Comic Sans MS" w:cs="Comic Sans MS" w:eastAsia="Comic Sans MS" w:hAnsi="Comic Sans MS"/>
+              <w:spacing w:after="30"/>
+            </w:pPr>
+            <w:r>
+              <w:rPr>
+                <w:rFonts w:ascii="Comic Sans MS" w:cs="Comic Sans MS" w:eastAsia="Comic Sans MS" w:hAnsi="Comic Sans MS"/>
+                <w:color w:val="16243A"/>
                 <w:sz w:val="21"/>
                 <w:szCs w:val="21"/>
               </w:rPr>
-              <w:t xml:space="preserve">Reifenmontiergerät, Auswuchtmaschine</w:t>
+              <w:t xml:space="preserve">Diagnose-Computer</w:t>
             </w:r>
           </w:p>
           <w:p>
@@ -1700,15 +2708,16 @@
                 <w:ilvl w:val="0"/>
                 <w:numId w:val="2"/>
               </w:numPr>
-              <w:spacing w:after="40"/>
-            </w:pPr>
-            <w:r>
-              <w:rPr>
-                <w:rFonts w:ascii="Comic Sans MS" w:cs="Comic Sans MS" w:eastAsia="Comic Sans MS" w:hAnsi="Comic Sans MS"/>
+              <w:spacing w:after="30"/>
+            </w:pPr>
+            <w:r>
+              <w:rPr>
+                <w:rFonts w:ascii="Comic Sans MS" w:cs="Comic Sans MS" w:eastAsia="Comic Sans MS" w:hAnsi="Comic Sans MS"/>
+                <w:color w:val="16243A"/>
                 <w:sz w:val="21"/>
                 <w:szCs w:val="21"/>
               </w:rPr>
-              <w:t xml:space="preserve">Abgasmessgerät</w:t>
+              <w:t xml:space="preserve">Reifenmontiergerät, Auswuchtmaschine</w:t>
             </w:r>
           </w:p>
           <w:p>
@@ -1718,50 +2727,16 @@
                 <w:ilvl w:val="0"/>
                 <w:numId w:val="2"/>
               </w:numPr>
-              <w:spacing w:after="40"/>
-            </w:pPr>
-            <w:r>
-              <w:rPr>
-                <w:rFonts w:ascii="Comic Sans MS" w:cs="Comic Sans MS" w:eastAsia="Comic Sans MS" w:hAnsi="Comic Sans MS"/>
+              <w:spacing w:after="30"/>
+            </w:pPr>
+            <w:r>
+              <w:rPr>
+                <w:rFonts w:ascii="Comic Sans MS" w:cs="Comic Sans MS" w:eastAsia="Comic Sans MS" w:hAnsi="Comic Sans MS"/>
+                <w:color w:val="16243A"/>
                 <w:sz w:val="21"/>
                 <w:szCs w:val="21"/>
               </w:rPr>
-              <w:t xml:space="preserve">Material: Motoröl, Ersatzteile, Schrauben, Bremsflüssigkeit</w:t>
-            </w:r>
-          </w:p>
-        </w:tc>
-        <w:tc>
-          <w:tcPr>
-            <w:tcW w:type="dxa" w:w="5316"/>
-            <w:tcBorders>
-              <w:top w:val="single" w:color="1F4E9E" w:sz="12"/>
-              <w:left w:val="single" w:color="1F4E9E" w:sz="12"/>
-              <w:bottom w:val="single" w:color="1F4E9E" w:sz="12"/>
-              <w:right w:val="single" w:color="1F4E9E" w:sz="12"/>
-            </w:tcBorders>
-            <w:tcMar>
-              <w:top w:type="dxa" w:w="120"/>
-              <w:left w:type="dxa" w:w="160"/>
-              <w:bottom w:type="dxa" w:w="120"/>
-              <w:right w:type="dxa" w:w="160"/>
-            </w:tcMar>
-          </w:tcPr>
-          <w:p>
-            <w:pPr>
-              <w:shd w:fill="DCE6F5" w:color="auto" w:val="clear"/>
-              <w:spacing w:after="160"/>
-              <w:jc w:val="center"/>
-            </w:pPr>
-            <w:r>
-              <w:rPr>
-                <w:rFonts w:ascii="Comic Sans MS" w:cs="Comic Sans MS" w:eastAsia="Comic Sans MS" w:hAnsi="Comic Sans MS"/>
-                <w:b/>
-                <w:bCs/>
-                <w:color w:val="1F4E9E"/>
-                <w:sz w:val="24"/>
-                <w:szCs w:val="24"/>
-              </w:rPr>
-              <w:t xml:space="preserve">Arbeitsbedingungen</w:t>
+              <w:t xml:space="preserve">Abgasmessgerät</w:t>
             </w:r>
           </w:p>
           <w:p>
@@ -1771,15 +2746,90 @@
                 <w:ilvl w:val="0"/>
                 <w:numId w:val="2"/>
               </w:numPr>
-              <w:spacing w:after="40"/>
-            </w:pPr>
-            <w:r>
-              <w:rPr>
-                <w:rFonts w:ascii="Comic Sans MS" w:cs="Comic Sans MS" w:eastAsia="Comic Sans MS" w:hAnsi="Comic Sans MS"/>
+              <w:spacing w:after="30"/>
+            </w:pPr>
+            <w:r>
+              <w:rPr>
+                <w:rFonts w:ascii="Comic Sans MS" w:cs="Comic Sans MS" w:eastAsia="Comic Sans MS" w:hAnsi="Comic Sans MS"/>
+                <w:color w:val="16243A"/>
                 <w:sz w:val="21"/>
                 <w:szCs w:val="21"/>
               </w:rPr>
-              <w:t xml:space="preserve">– Stehen, unbequeme Haltung (Rücken, Knie)</w:t>
+              <w:t xml:space="preserve">Material: Motoröl, Ersatzteile, Schrauben, Bremsflüssigkeit</w:t>
+            </w:r>
+          </w:p>
+        </w:tc>
+        <w:tc>
+          <w:tcPr>
+            <w:vMerge w:val="continue"/>
+            <w:tcBorders>
+              <w:top w:val="none" w:color="FFFFFF" w:sz="0"/>
+              <w:left w:val="none" w:color="FFFFFF" w:sz="0"/>
+              <w:bottom w:val="none" w:color="FFFFFF" w:sz="0"/>
+              <w:right w:val="none" w:color="FFFFFF" w:sz="0"/>
+            </w:tcBorders>
+          </w:tcPr>
+          <w:p/>
+        </w:tc>
+        <w:tc>
+          <w:tcPr>
+            <w:tcW w:type="dxa" w:w="3900"/>
+            <w:tcBorders>
+              <w:top w:val="none" w:color="FFFFFF" w:sz="0"/>
+              <w:left w:val="none" w:color="FFFFFF" w:sz="0"/>
+              <w:bottom w:val="none" w:color="FFFFFF" w:sz="0"/>
+              <w:right w:val="none" w:color="FFFFFF" w:sz="0"/>
+            </w:tcBorders>
+            <w:tcMar>
+              <w:top w:type="dxa" w:w="60"/>
+              <w:left w:type="dxa" w:w="80"/>
+              <w:right w:type="dxa" w:w="80"/>
+            </w:tcMar>
+          </w:tcPr>
+          <w:p>
+            <w:pPr>
+              <w:spacing w:after="60"/>
+              <w:jc w:val="center"/>
+            </w:pPr>
+            <w:r>
+              <w:drawing>
+                <wp:inline distT="0" distB="0" distL="0" distR="0">
+                  <wp:extent cx="2381250" cy="819150"/>
+                  <wp:effectExtent t="0" r="0" b="0" l="0"/>
+                  <wp:docPr id="1" name="" descr="" title=""/>
+                  <wp:cNvGraphicFramePr>
+                    <a:graphicFrameLocks xmlns:a="http://schemas.openxmlformats.org/drawingml/2006/main" noChangeAspect="1"/>
+                  </wp:cNvGraphicFramePr>
+                  <a:graphic xmlns:a="http://schemas.openxmlformats.org/drawingml/2006/main">
+                    <a:graphicData uri="http://schemas.openxmlformats.org/drawingml/2006/picture">
+                      <pic:pic xmlns:pic="http://schemas.openxmlformats.org/drawingml/2006/picture">
+                        <pic:nvPicPr>
+                          <pic:cNvPr id="0" name="" descr=""/>
+                          <pic:cNvPicPr>
+                            <a:picLocks noChangeAspect="1" noChangeArrowheads="1"/>
+                          </pic:cNvPicPr>
+                        </pic:nvPicPr>
+                        <pic:blipFill>
+                          <a:blip r:embed="rId11" cstate="none"/>
+                          <a:srcRect/>
+                          <a:stretch>
+                            <a:fillRect/>
+                          </a:stretch>
+                        </pic:blipFill>
+                        <pic:spPr bwMode="auto">
+                          <a:xfrm>
+                            <a:off x="0" y="0"/>
+                            <a:ext cx="2381250" cy="819150"/>
+                          </a:xfrm>
+                          <a:prstGeom prst="rect">
+                            <a:avLst/>
+                          </a:prstGeom>
+                        </pic:spPr>
+                      </pic:pic>
+                    </a:graphicData>
+                  </a:graphic>
+                </wp:inline>
+              </w:drawing>
             </w:r>
           </w:p>
           <w:p>
@@ -1789,15 +2839,16 @@
                 <w:ilvl w:val="0"/>
                 <w:numId w:val="2"/>
               </w:numPr>
-              <w:spacing w:after="40"/>
-            </w:pPr>
-            <w:r>
-              <w:rPr>
-                <w:rFonts w:ascii="Comic Sans MS" w:cs="Comic Sans MS" w:eastAsia="Comic Sans MS" w:hAnsi="Comic Sans MS"/>
+              <w:spacing w:after="30"/>
+            </w:pPr>
+            <w:r>
+              <w:rPr>
+                <w:rFonts w:ascii="Comic Sans MS" w:cs="Comic Sans MS" w:eastAsia="Comic Sans MS" w:hAnsi="Comic Sans MS"/>
+                <w:color w:val="16243A"/>
                 <w:sz w:val="21"/>
                 <w:szCs w:val="21"/>
               </w:rPr>
-              <w:t xml:space="preserve">– laut, im Winter kalt / Zugluft</w:t>
+              <w:t xml:space="preserve">– Stehen, unbequeme Haltung (Rücken, Knie)</w:t>
             </w:r>
           </w:p>
           <w:p>
@@ -1807,15 +2858,16 @@
                 <w:ilvl w:val="0"/>
                 <w:numId w:val="2"/>
               </w:numPr>
-              <w:spacing w:after="40"/>
-            </w:pPr>
-            <w:r>
-              <w:rPr>
-                <w:rFonts w:ascii="Comic Sans MS" w:cs="Comic Sans MS" w:eastAsia="Comic Sans MS" w:hAnsi="Comic Sans MS"/>
+              <w:spacing w:after="30"/>
+            </w:pPr>
+            <w:r>
+              <w:rPr>
+                <w:rFonts w:ascii="Comic Sans MS" w:cs="Comic Sans MS" w:eastAsia="Comic Sans MS" w:hAnsi="Comic Sans MS"/>
+                <w:color w:val="16243A"/>
                 <w:sz w:val="21"/>
                 <w:szCs w:val="21"/>
               </w:rPr>
-              <w:t xml:space="preserve">– Schmutz (Öl, Fett)</w:t>
+              <w:t xml:space="preserve">– laut, im Winter kalt</w:t>
             </w:r>
           </w:p>
           <w:p>
@@ -1825,15 +2877,16 @@
                 <w:ilvl w:val="0"/>
                 <w:numId w:val="2"/>
               </w:numPr>
-              <w:spacing w:after="40"/>
-            </w:pPr>
-            <w:r>
-              <w:rPr>
-                <w:rFonts w:ascii="Comic Sans MS" w:cs="Comic Sans MS" w:eastAsia="Comic Sans MS" w:hAnsi="Comic Sans MS"/>
+              <w:spacing w:after="30"/>
+            </w:pPr>
+            <w:r>
+              <w:rPr>
+                <w:rFonts w:ascii="Comic Sans MS" w:cs="Comic Sans MS" w:eastAsia="Comic Sans MS" w:hAnsi="Comic Sans MS"/>
+                <w:color w:val="16243A"/>
                 <w:sz w:val="21"/>
                 <w:szCs w:val="21"/>
               </w:rPr>
-              <w:t xml:space="preserve">– Verletzungsgefahr, Hochspannung (E-Autos)</w:t>
+              <w:t xml:space="preserve">– Schmutz (Öl, Fett)</w:t>
             </w:r>
           </w:p>
           <w:p>
@@ -1843,15 +2896,16 @@
                 <w:ilvl w:val="0"/>
                 <w:numId w:val="2"/>
               </w:numPr>
-              <w:spacing w:after="40"/>
-            </w:pPr>
-            <w:r>
-              <w:rPr>
-                <w:rFonts w:ascii="Comic Sans MS" w:cs="Comic Sans MS" w:eastAsia="Comic Sans MS" w:hAnsi="Comic Sans MS"/>
+              <w:spacing w:after="30"/>
+            </w:pPr>
+            <w:r>
+              <w:rPr>
+                <w:rFonts w:ascii="Comic Sans MS" w:cs="Comic Sans MS" w:eastAsia="Comic Sans MS" w:hAnsi="Comic Sans MS"/>
+                <w:color w:val="16243A"/>
                 <w:sz w:val="21"/>
                 <w:szCs w:val="21"/>
               </w:rPr>
-              <w:t xml:space="preserve">+ Arbeit unter einem Dach</w:t>
+              <w:t xml:space="preserve">– Verletzungsgefahr, Hochspannung</w:t>
             </w:r>
           </w:p>
           <w:p>
@@ -1861,55 +2915,16 @@
                 <w:ilvl w:val="0"/>
                 <w:numId w:val="2"/>
               </w:numPr>
-              <w:spacing w:after="40"/>
-            </w:pPr>
-            <w:r>
-              <w:rPr>
-                <w:rFonts w:ascii="Comic Sans MS" w:cs="Comic Sans MS" w:eastAsia="Comic Sans MS" w:hAnsi="Comic Sans MS"/>
+              <w:spacing w:after="30"/>
+            </w:pPr>
+            <w:r>
+              <w:rPr>
+                <w:rFonts w:ascii="Comic Sans MS" w:cs="Comic Sans MS" w:eastAsia="Comic Sans MS" w:hAnsi="Comic Sans MS"/>
+                <w:color w:val="16243A"/>
                 <w:sz w:val="21"/>
                 <w:szCs w:val="21"/>
               </w:rPr>
-              <w:t xml:space="preserve">+ feste Arbeitszeiten, Wochenende frei</w:t>
-            </w:r>
-          </w:p>
-        </w:tc>
-      </w:tr>
-      <w:tr>
-        <w:trPr>
-          <w:trHeight w:val="2600" w:hRule="atLeast"/>
-        </w:trPr>
-        <w:tc>
-          <w:tcPr>
-            <w:tcW w:type="dxa" w:w="5316"/>
-            <w:tcBorders>
-              <w:top w:val="single" w:color="1F4E9E" w:sz="12"/>
-              <w:left w:val="single" w:color="1F4E9E" w:sz="12"/>
-              <w:bottom w:val="single" w:color="1F4E9E" w:sz="12"/>
-              <w:right w:val="single" w:color="1F4E9E" w:sz="12"/>
-            </w:tcBorders>
-            <w:tcMar>
-              <w:top w:type="dxa" w:w="120"/>
-              <w:left w:type="dxa" w:w="160"/>
-              <w:bottom w:type="dxa" w:w="120"/>
-              <w:right w:type="dxa" w:w="160"/>
-            </w:tcMar>
-          </w:tcPr>
-          <w:p>
-            <w:pPr>
-              <w:shd w:fill="DCE6F5" w:color="auto" w:val="clear"/>
-              <w:spacing w:after="160"/>
-              <w:jc w:val="center"/>
-            </w:pPr>
-            <w:r>
-              <w:rPr>
-                <w:rFonts w:ascii="Comic Sans MS" w:cs="Comic Sans MS" w:eastAsia="Comic Sans MS" w:hAnsi="Comic Sans MS"/>
-                <w:b/>
-                <w:bCs/>
-                <w:color w:val="1F4E9E"/>
-                <w:sz w:val="24"/>
-                <w:szCs w:val="24"/>
-              </w:rPr>
-              <w:t xml:space="preserve">Anforderungen / Fähigkeiten</w:t>
+              <w:t xml:space="preserve">+ Arbeit unter einem Dach</w:t>
             </w:r>
           </w:p>
           <w:p>
@@ -1919,15 +2934,84 @@
                 <w:ilvl w:val="0"/>
                 <w:numId w:val="2"/>
               </w:numPr>
-              <w:spacing w:after="40"/>
-            </w:pPr>
-            <w:r>
-              <w:rPr>
-                <w:rFonts w:ascii="Comic Sans MS" w:cs="Comic Sans MS" w:eastAsia="Comic Sans MS" w:hAnsi="Comic Sans MS"/>
+              <w:spacing w:after="30"/>
+            </w:pPr>
+            <w:r>
+              <w:rPr>
+                <w:rFonts w:ascii="Comic Sans MS" w:cs="Comic Sans MS" w:eastAsia="Comic Sans MS" w:hAnsi="Comic Sans MS"/>
+                <w:color w:val="16243A"/>
                 <w:sz w:val="21"/>
                 <w:szCs w:val="21"/>
               </w:rPr>
-              <w:t xml:space="preserve">handwerkliches Geschick</w:t>
+              <w:t xml:space="preserve">+ feste Arbeitszeiten, Wochenende frei</w:t>
+            </w:r>
+          </w:p>
+        </w:tc>
+      </w:tr>
+      <w:tr>
+        <w:trPr>
+          <w:cantSplit/>
+          <w:trHeight w:val="4300" w:hRule="atLeast"/>
+        </w:trPr>
+        <w:tc>
+          <w:tcPr>
+            <w:tcW w:type="dxa" w:w="3900"/>
+            <w:tcBorders>
+              <w:top w:val="none" w:color="FFFFFF" w:sz="0"/>
+              <w:left w:val="none" w:color="FFFFFF" w:sz="0"/>
+              <w:bottom w:val="none" w:color="FFFFFF" w:sz="0"/>
+              <w:right w:val="none" w:color="FFFFFF" w:sz="0"/>
+            </w:tcBorders>
+            <w:tcMar>
+              <w:top w:type="dxa" w:w="60"/>
+              <w:left w:type="dxa" w:w="80"/>
+              <w:right w:type="dxa" w:w="80"/>
+            </w:tcMar>
+          </w:tcPr>
+          <w:p>
+            <w:pPr>
+              <w:spacing w:after="60"/>
+              <w:jc w:val="center"/>
+            </w:pPr>
+            <w:r>
+              <w:drawing>
+                <wp:inline distT="0" distB="0" distL="0" distR="0">
+                  <wp:extent cx="2381250" cy="819150"/>
+                  <wp:effectExtent t="0" r="0" b="0" l="0"/>
+                  <wp:docPr id="1" name="" descr="" title=""/>
+                  <wp:cNvGraphicFramePr>
+                    <a:graphicFrameLocks xmlns:a="http://schemas.openxmlformats.org/drawingml/2006/main" noChangeAspect="1"/>
+                  </wp:cNvGraphicFramePr>
+                  <a:graphic xmlns:a="http://schemas.openxmlformats.org/drawingml/2006/main">
+                    <a:graphicData uri="http://schemas.openxmlformats.org/drawingml/2006/picture">
+                      <pic:pic xmlns:pic="http://schemas.openxmlformats.org/drawingml/2006/picture">
+                        <pic:nvPicPr>
+                          <pic:cNvPr id="0" name="" descr=""/>
+                          <pic:cNvPicPr>
+                            <a:picLocks noChangeAspect="1" noChangeArrowheads="1"/>
+                          </pic:cNvPicPr>
+                        </pic:nvPicPr>
+                        <pic:blipFill>
+                          <a:blip r:embed="rId12" cstate="none"/>
+                          <a:srcRect/>
+                          <a:stretch>
+                            <a:fillRect/>
+                          </a:stretch>
+                        </pic:blipFill>
+                        <pic:spPr bwMode="auto">
+                          <a:xfrm>
+                            <a:off x="0" y="0"/>
+                            <a:ext cx="2381250" cy="819150"/>
+                          </a:xfrm>
+                          <a:prstGeom prst="rect">
+                            <a:avLst/>
+                          </a:prstGeom>
+                        </pic:spPr>
+                      </pic:pic>
+                    </a:graphicData>
+                  </a:graphic>
+                </wp:inline>
+              </w:drawing>
             </w:r>
           </w:p>
           <w:p>
@@ -1937,15 +3021,16 @@
                 <w:ilvl w:val="0"/>
                 <w:numId w:val="2"/>
               </w:numPr>
-              <w:spacing w:after="40"/>
-            </w:pPr>
-            <w:r>
-              <w:rPr>
-                <w:rFonts w:ascii="Comic Sans MS" w:cs="Comic Sans MS" w:eastAsia="Comic Sans MS" w:hAnsi="Comic Sans MS"/>
+              <w:spacing w:after="30"/>
+            </w:pPr>
+            <w:r>
+              <w:rPr>
+                <w:rFonts w:ascii="Comic Sans MS" w:cs="Comic Sans MS" w:eastAsia="Comic Sans MS" w:hAnsi="Comic Sans MS"/>
+                <w:color w:val="16243A"/>
                 <w:sz w:val="21"/>
                 <w:szCs w:val="21"/>
               </w:rPr>
-              <w:t xml:space="preserve">technisches Verständnis</w:t>
+              <w:t xml:space="preserve">handwerkliches Geschick</w:t>
             </w:r>
           </w:p>
           <w:p>
@@ -1955,15 +3040,16 @@
                 <w:ilvl w:val="0"/>
                 <w:numId w:val="2"/>
               </w:numPr>
-              <w:spacing w:after="40"/>
-            </w:pPr>
-            <w:r>
-              <w:rPr>
-                <w:rFonts w:ascii="Comic Sans MS" w:cs="Comic Sans MS" w:eastAsia="Comic Sans MS" w:hAnsi="Comic Sans MS"/>
+              <w:spacing w:after="30"/>
+            </w:pPr>
+            <w:r>
+              <w:rPr>
+                <w:rFonts w:ascii="Comic Sans MS" w:cs="Comic Sans MS" w:eastAsia="Comic Sans MS" w:hAnsi="Comic Sans MS"/>
+                <w:color w:val="16243A"/>
                 <w:sz w:val="21"/>
                 <w:szCs w:val="21"/>
               </w:rPr>
-              <w:t xml:space="preserve">Mathe und Physik</w:t>
+              <w:t xml:space="preserve">technisches Verständnis</w:t>
             </w:r>
           </w:p>
           <w:p>
@@ -1973,15 +3059,16 @@
                 <w:ilvl w:val="0"/>
                 <w:numId w:val="2"/>
               </w:numPr>
-              <w:spacing w:after="40"/>
-            </w:pPr>
-            <w:r>
-              <w:rPr>
-                <w:rFonts w:ascii="Comic Sans MS" w:cs="Comic Sans MS" w:eastAsia="Comic Sans MS" w:hAnsi="Comic Sans MS"/>
+              <w:spacing w:after="30"/>
+            </w:pPr>
+            <w:r>
+              <w:rPr>
+                <w:rFonts w:ascii="Comic Sans MS" w:cs="Comic Sans MS" w:eastAsia="Comic Sans MS" w:hAnsi="Comic Sans MS"/>
+                <w:color w:val="16243A"/>
                 <w:sz w:val="21"/>
                 <w:szCs w:val="21"/>
               </w:rPr>
-              <w:t xml:space="preserve">sorgfältig und genau arbeiten</w:t>
+              <w:t xml:space="preserve">Mathe und Physik</w:t>
             </w:r>
           </w:p>
           <w:p>
@@ -1991,15 +3078,16 @@
                 <w:ilvl w:val="0"/>
                 <w:numId w:val="2"/>
               </w:numPr>
-              <w:spacing w:after="40"/>
-            </w:pPr>
-            <w:r>
-              <w:rPr>
-                <w:rFonts w:ascii="Comic Sans MS" w:cs="Comic Sans MS" w:eastAsia="Comic Sans MS" w:hAnsi="Comic Sans MS"/>
+              <w:spacing w:after="30"/>
+            </w:pPr>
+            <w:r>
+              <w:rPr>
+                <w:rFonts w:ascii="Comic Sans MS" w:cs="Comic Sans MS" w:eastAsia="Comic Sans MS" w:hAnsi="Comic Sans MS"/>
+                <w:color w:val="16243A"/>
                 <w:sz w:val="21"/>
                 <w:szCs w:val="21"/>
               </w:rPr>
-              <w:t xml:space="preserve">körperlich fit, Umgang mit Computern</w:t>
+              <w:t xml:space="preserve">sorgfältig und genau</w:t>
             </w:r>
           </w:p>
           <w:p>
@@ -2009,15 +3097,16 @@
                 <w:ilvl w:val="0"/>
                 <w:numId w:val="2"/>
               </w:numPr>
-              <w:spacing w:after="40"/>
-            </w:pPr>
-            <w:r>
-              <w:rPr>
-                <w:rFonts w:ascii="Comic Sans MS" w:cs="Comic Sans MS" w:eastAsia="Comic Sans MS" w:hAnsi="Comic Sans MS"/>
+              <w:spacing w:after="30"/>
+            </w:pPr>
+            <w:r>
+              <w:rPr>
+                <w:rFonts w:ascii="Comic Sans MS" w:cs="Comic Sans MS" w:eastAsia="Comic Sans MS" w:hAnsi="Comic Sans MS"/>
+                <w:color w:val="16243A"/>
                 <w:sz w:val="21"/>
                 <w:szCs w:val="21"/>
               </w:rPr>
-              <w:t xml:space="preserve">freundlich, gut erklären können</w:t>
+              <w:t xml:space="preserve">körperlich fit, Computer</w:t>
             </w:r>
           </w:p>
           <w:p>
@@ -2027,50 +3116,16 @@
                 <w:ilvl w:val="0"/>
                 <w:numId w:val="2"/>
               </w:numPr>
-              <w:spacing w:after="40"/>
-            </w:pPr>
-            <w:r>
-              <w:rPr>
-                <w:rFonts w:ascii="Comic Sans MS" w:cs="Comic Sans MS" w:eastAsia="Comic Sans MS" w:hAnsi="Comic Sans MS"/>
+              <w:spacing w:after="30"/>
+            </w:pPr>
+            <w:r>
+              <w:rPr>
+                <w:rFonts w:ascii="Comic Sans MS" w:cs="Comic Sans MS" w:eastAsia="Comic Sans MS" w:hAnsi="Comic Sans MS"/>
+                <w:color w:val="16243A"/>
                 <w:sz w:val="21"/>
                 <w:szCs w:val="21"/>
               </w:rPr>
-              <w:t xml:space="preserve">regelmäßige Weiterbildung (Schulungen)</w:t>
-            </w:r>
-          </w:p>
-        </w:tc>
-        <w:tc>
-          <w:tcPr>
-            <w:tcW w:type="dxa" w:w="5316"/>
-            <w:tcBorders>
-              <w:top w:val="single" w:color="1F4E9E" w:sz="12"/>
-              <w:left w:val="single" w:color="1F4E9E" w:sz="12"/>
-              <w:bottom w:val="single" w:color="1F4E9E" w:sz="12"/>
-              <w:right w:val="single" w:color="1F4E9E" w:sz="12"/>
-            </w:tcBorders>
-            <w:tcMar>
-              <w:top w:type="dxa" w:w="120"/>
-              <w:left w:type="dxa" w:w="160"/>
-              <w:bottom w:type="dxa" w:w="120"/>
-              <w:right w:type="dxa" w:w="160"/>
-            </w:tcMar>
-          </w:tcPr>
-          <w:p>
-            <w:pPr>
-              <w:shd w:fill="DCE6F5" w:color="auto" w:val="clear"/>
-              <w:spacing w:after="160"/>
-              <w:jc w:val="center"/>
-            </w:pPr>
-            <w:r>
-              <w:rPr>
-                <w:rFonts w:ascii="Comic Sans MS" w:cs="Comic Sans MS" w:eastAsia="Comic Sans MS" w:hAnsi="Comic Sans MS"/>
-                <w:b/>
-                <w:bCs/>
-                <w:color w:val="1F4E9E"/>
-                <w:sz w:val="24"/>
-                <w:szCs w:val="24"/>
-              </w:rPr>
-              <w:t xml:space="preserve">Gründe für die Berufswahl</w:t>
+              <w:t xml:space="preserve">freundlich, gut erklären</w:t>
             </w:r>
           </w:p>
           <w:p>
@@ -2080,15 +3135,90 @@
                 <w:ilvl w:val="0"/>
                 <w:numId w:val="2"/>
               </w:numPr>
-              <w:spacing w:after="40"/>
-            </w:pPr>
-            <w:r>
-              <w:rPr>
-                <w:rFonts w:ascii="Comic Sans MS" w:cs="Comic Sans MS" w:eastAsia="Comic Sans MS" w:hAnsi="Comic Sans MS"/>
+              <w:spacing w:after="30"/>
+            </w:pPr>
+            <w:r>
+              <w:rPr>
+                <w:rFonts w:ascii="Comic Sans MS" w:cs="Comic Sans MS" w:eastAsia="Comic Sans MS" w:hAnsi="Comic Sans MS"/>
+                <w:color w:val="16243A"/>
                 <w:sz w:val="21"/>
                 <w:szCs w:val="21"/>
               </w:rPr>
-              <w:t xml:space="preserve">Interesse an Technik</w:t>
+              <w:t xml:space="preserve">regelmäßige Schulungen</w:t>
+            </w:r>
+          </w:p>
+        </w:tc>
+        <w:tc>
+          <w:tcPr>
+            <w:vMerge w:val="continue"/>
+            <w:tcBorders>
+              <w:top w:val="none" w:color="FFFFFF" w:sz="0"/>
+              <w:left w:val="none" w:color="FFFFFF" w:sz="0"/>
+              <w:bottom w:val="none" w:color="FFFFFF" w:sz="0"/>
+              <w:right w:val="none" w:color="FFFFFF" w:sz="0"/>
+            </w:tcBorders>
+          </w:tcPr>
+          <w:p/>
+        </w:tc>
+        <w:tc>
+          <w:tcPr>
+            <w:tcW w:type="dxa" w:w="3900"/>
+            <w:tcBorders>
+              <w:top w:val="none" w:color="FFFFFF" w:sz="0"/>
+              <w:left w:val="none" w:color="FFFFFF" w:sz="0"/>
+              <w:bottom w:val="none" w:color="FFFFFF" w:sz="0"/>
+              <w:right w:val="none" w:color="FFFFFF" w:sz="0"/>
+            </w:tcBorders>
+            <w:tcMar>
+              <w:top w:type="dxa" w:w="60"/>
+              <w:left w:type="dxa" w:w="80"/>
+              <w:right w:type="dxa" w:w="80"/>
+            </w:tcMar>
+          </w:tcPr>
+          <w:p>
+            <w:pPr>
+              <w:spacing w:after="60"/>
+              <w:jc w:val="center"/>
+            </w:pPr>
+            <w:r>
+              <w:drawing>
+                <wp:inline distT="0" distB="0" distL="0" distR="0">
+                  <wp:extent cx="2381250" cy="819150"/>
+                  <wp:effectExtent t="0" r="0" b="0" l="0"/>
+                  <wp:docPr id="1" name="" descr="" title=""/>
+                  <wp:cNvGraphicFramePr>
+                    <a:graphicFrameLocks xmlns:a="http://schemas.openxmlformats.org/drawingml/2006/main" noChangeAspect="1"/>
+                  </wp:cNvGraphicFramePr>
+                  <a:graphic xmlns:a="http://schemas.openxmlformats.org/drawingml/2006/main">
+                    <a:graphicData uri="http://schemas.openxmlformats.org/drawingml/2006/picture">
+                      <pic:pic xmlns:pic="http://schemas.openxmlformats.org/drawingml/2006/picture">
+                        <pic:nvPicPr>
+                          <pic:cNvPr id="0" name="" descr=""/>
+                          <pic:cNvPicPr>
+                            <a:picLocks noChangeAspect="1" noChangeArrowheads="1"/>
+                          </pic:cNvPicPr>
+                        </pic:nvPicPr>
+                        <pic:blipFill>
+                          <a:blip r:embed="rId13" cstate="none"/>
+                          <a:srcRect/>
+                          <a:stretch>
+                            <a:fillRect/>
+                          </a:stretch>
+                        </pic:blipFill>
+                        <pic:spPr bwMode="auto">
+                          <a:xfrm>
+                            <a:off x="0" y="0"/>
+                            <a:ext cx="2381250" cy="819150"/>
+                          </a:xfrm>
+                          <a:prstGeom prst="rect">
+                            <a:avLst/>
+                          </a:prstGeom>
+                        </pic:spPr>
+                      </pic:pic>
+                    </a:graphicData>
+                  </a:graphic>
+                </wp:inline>
+              </w:drawing>
             </w:r>
           </w:p>
           <w:p>
@@ -2098,15 +3228,16 @@
                 <w:ilvl w:val="0"/>
                 <w:numId w:val="2"/>
               </w:numPr>
-              <w:spacing w:after="40"/>
-            </w:pPr>
-            <w:r>
-              <w:rPr>
-                <w:rFonts w:ascii="Comic Sans MS" w:cs="Comic Sans MS" w:eastAsia="Comic Sans MS" w:hAnsi="Comic Sans MS"/>
+              <w:spacing w:after="30"/>
+            </w:pPr>
+            <w:r>
+              <w:rPr>
+                <w:rFonts w:ascii="Comic Sans MS" w:cs="Comic Sans MS" w:eastAsia="Comic Sans MS" w:hAnsi="Comic Sans MS"/>
+                <w:color w:val="16243A"/>
                 <w:sz w:val="21"/>
                 <w:szCs w:val="21"/>
               </w:rPr>
-              <w:t xml:space="preserve">Erfolgserlebnis, Lob vom Kunden</w:t>
+              <w:t xml:space="preserve">Interesse an Technik</w:t>
             </w:r>
           </w:p>
           <w:p>
@@ -2116,15 +3247,16 @@
                 <w:ilvl w:val="0"/>
                 <w:numId w:val="2"/>
               </w:numPr>
-              <w:spacing w:after="40"/>
-            </w:pPr>
-            <w:r>
-              <w:rPr>
-                <w:rFonts w:ascii="Comic Sans MS" w:cs="Comic Sans MS" w:eastAsia="Comic Sans MS" w:hAnsi="Comic Sans MS"/>
+              <w:spacing w:after="30"/>
+            </w:pPr>
+            <w:r>
+              <w:rPr>
+                <w:rFonts w:ascii="Comic Sans MS" w:cs="Comic Sans MS" w:eastAsia="Comic Sans MS" w:hAnsi="Comic Sans MS"/>
+                <w:color w:val="16243A"/>
                 <w:sz w:val="21"/>
                 <w:szCs w:val="21"/>
               </w:rPr>
-              <w:t xml:space="preserve">gutes Team</w:t>
+              <w:t xml:space="preserve">Erfolgserlebnis, Lob</w:t>
             </w:r>
           </w:p>
           <w:p>
@@ -2134,15 +3266,16 @@
                 <w:ilvl w:val="0"/>
                 <w:numId w:val="2"/>
               </w:numPr>
-              <w:spacing w:after="40"/>
-            </w:pPr>
-            <w:r>
-              <w:rPr>
-                <w:rFonts w:ascii="Comic Sans MS" w:cs="Comic Sans MS" w:eastAsia="Comic Sans MS" w:hAnsi="Comic Sans MS"/>
+              <w:spacing w:after="30"/>
+            </w:pPr>
+            <w:r>
+              <w:rPr>
+                <w:rFonts w:ascii="Comic Sans MS" w:cs="Comic Sans MS" w:eastAsia="Comic Sans MS" w:hAnsi="Comic Sans MS"/>
+                <w:color w:val="16243A"/>
                 <w:sz w:val="21"/>
                 <w:szCs w:val="21"/>
               </w:rPr>
-              <w:t xml:space="preserve">sicherer Arbeitsplatz</w:t>
+              <w:t xml:space="preserve">gutes Team</w:t>
             </w:r>
           </w:p>
           <w:p>
@@ -2152,15 +3285,16 @@
                 <w:ilvl w:val="0"/>
                 <w:numId w:val="2"/>
               </w:numPr>
-              <w:spacing w:after="40"/>
-            </w:pPr>
-            <w:r>
-              <w:rPr>
-                <w:rFonts w:ascii="Comic Sans MS" w:cs="Comic Sans MS" w:eastAsia="Comic Sans MS" w:hAnsi="Comic Sans MS"/>
+              <w:spacing w:after="30"/>
+            </w:pPr>
+            <w:r>
+              <w:rPr>
+                <w:rFonts w:ascii="Comic Sans MS" w:cs="Comic Sans MS" w:eastAsia="Comic Sans MS" w:hAnsi="Comic Sans MS"/>
+                <w:color w:val="16243A"/>
                 <w:sz w:val="21"/>
                 <w:szCs w:val="21"/>
               </w:rPr>
-              <w:t xml:space="preserve">Lohn in Ordnung</w:t>
+              <w:t xml:space="preserve">sicherer Arbeitsplatz</w:t>
             </w:r>
           </w:p>
           <w:p>
@@ -2170,15 +3304,35 @@
                 <w:ilvl w:val="0"/>
                 <w:numId w:val="2"/>
               </w:numPr>
-              <w:spacing w:after="40"/>
-            </w:pPr>
-            <w:r>
-              <w:rPr>
-                <w:rFonts w:ascii="Comic Sans MS" w:cs="Comic Sans MS" w:eastAsia="Comic Sans MS" w:hAnsi="Comic Sans MS"/>
+              <w:spacing w:after="30"/>
+            </w:pPr>
+            <w:r>
+              <w:rPr>
+                <w:rFonts w:ascii="Comic Sans MS" w:cs="Comic Sans MS" w:eastAsia="Comic Sans MS" w:hAnsi="Comic Sans MS"/>
+                <w:color w:val="16243A"/>
                 <w:sz w:val="21"/>
                 <w:szCs w:val="21"/>
               </w:rPr>
-              <w:t xml:space="preserve">Aufstieg: Meister, Werkstattleiter, selbstständig</w:t>
+              <w:t xml:space="preserve">Lohn in Ordnung</w:t>
+            </w:r>
+          </w:p>
+          <w:p>
+            <w:pPr>
+              <w:pStyle w:val="ListParagraph"/>
+              <w:numPr>
+                <w:ilvl w:val="0"/>
+                <w:numId w:val="2"/>
+              </w:numPr>
+              <w:spacing w:after="30"/>
+            </w:pPr>
+            <w:r>
+              <w:rPr>
+                <w:rFonts w:ascii="Comic Sans MS" w:cs="Comic Sans MS" w:eastAsia="Comic Sans MS" w:hAnsi="Comic Sans MS"/>
+                <w:color w:val="16243A"/>
+                <w:sz w:val="21"/>
+                <w:szCs w:val="21"/>
+              </w:rPr>
+              <w:t xml:space="preserve">Aufstieg: Meister, selbstständig</w:t>
             </w:r>
           </w:p>
         </w:tc>

</xml_diff>

<commit_message>
Wolken im Hefteintrag korrigiert; Material Medizinische Fachangestellte (Word, Audio, Webseite)
Co-Authored-By: Claude Opus 5.5 <noreply@anthropic.com>
Claude-Session: https://claude.ai/code/session_01FTW1Jxo9dMCKUL1bcqqfs9
</commit_message>
<xml_diff>
--- a/Arbeitsplatz_Kfz-Mechatroniker.docx
+++ b/Arbeitsplatz_Kfz-Mechatroniker.docx
@@ -4,7 +4,7 @@
   <w:body>
     <w:p>
       <w:pPr>
-        <w:spacing w:after="240"/>
+        <w:spacing w:after="200"/>
       </w:pPr>
       <w:r>
         <w:rPr>
@@ -66,20 +66,20 @@
               <w:right w:val="none" w:color="FFFFFF" w:sz="0"/>
             </w:tcBorders>
             <w:tcMar>
-              <w:top w:type="dxa" w:w="60"/>
+              <w:top w:type="dxa" w:w="40"/>
               <w:left w:type="dxa" w:w="80"/>
               <w:right w:type="dxa" w:w="80"/>
             </w:tcMar>
           </w:tcPr>
           <w:p>
             <w:pPr>
-              <w:spacing w:after="60"/>
+              <w:spacing w:after="40"/>
               <w:jc w:val="center"/>
             </w:pPr>
             <w:r>
               <w:drawing>
                 <wp:inline distT="0" distB="0" distL="0" distR="0">
-                  <wp:extent cx="2381250" cy="819150"/>
+                  <wp:extent cx="2381250" cy="904875"/>
                   <wp:effectExtent t="0" r="0" b="0" l="0"/>
                   <wp:docPr id="1" name="" descr="" title=""/>
                   <wp:cNvGraphicFramePr>
@@ -104,7 +104,7 @@
                         <pic:spPr bwMode="auto">
                           <a:xfrm>
                             <a:off x="0" y="0"/>
-                            <a:ext cx="2381250" cy="819150"/>
+                            <a:ext cx="2381250" cy="904875"/>
                           </a:xfrm>
                           <a:prstGeom prst="rect">
                             <a:avLst/>
@@ -122,7 +122,7 @@
               <w:tabs>
                 <w:tab w:val="right" w:pos="3640" w:leader="underscore"/>
               </w:tabs>
-              <w:spacing w:before="250"/>
+              <w:spacing w:before="240"/>
             </w:pPr>
             <w:r>
               <w:rPr>
@@ -139,7 +139,7 @@
               <w:tabs>
                 <w:tab w:val="right" w:pos="3640" w:leader="underscore"/>
               </w:tabs>
-              <w:spacing w:before="250"/>
+              <w:spacing w:before="240"/>
             </w:pPr>
             <w:r>
               <w:rPr>
@@ -156,7 +156,7 @@
               <w:tabs>
                 <w:tab w:val="right" w:pos="3640" w:leader="underscore"/>
               </w:tabs>
-              <w:spacing w:before="250"/>
+              <w:spacing w:before="240"/>
             </w:pPr>
             <w:r>
               <w:rPr>
@@ -173,7 +173,7 @@
               <w:tabs>
                 <w:tab w:val="right" w:pos="3640" w:leader="underscore"/>
               </w:tabs>
-              <w:spacing w:before="250"/>
+              <w:spacing w:before="240"/>
             </w:pPr>
             <w:r>
               <w:rPr>
@@ -190,7 +190,7 @@
               <w:tabs>
                 <w:tab w:val="right" w:pos="3640" w:leader="underscore"/>
               </w:tabs>
-              <w:spacing w:before="250"/>
+              <w:spacing w:before="240"/>
             </w:pPr>
             <w:r>
               <w:rPr>
@@ -207,7 +207,7 @@
               <w:tabs>
                 <w:tab w:val="right" w:pos="3640" w:leader="underscore"/>
               </w:tabs>
-              <w:spacing w:before="250"/>
+              <w:spacing w:before="240"/>
             </w:pPr>
             <w:r>
               <w:rPr>
@@ -288,20 +288,20 @@
               <w:right w:val="none" w:color="FFFFFF" w:sz="0"/>
             </w:tcBorders>
             <w:tcMar>
-              <w:top w:type="dxa" w:w="60"/>
+              <w:top w:type="dxa" w:w="40"/>
               <w:left w:type="dxa" w:w="80"/>
               <w:right w:type="dxa" w:w="80"/>
             </w:tcMar>
           </w:tcPr>
           <w:p>
             <w:pPr>
-              <w:spacing w:after="60"/>
+              <w:spacing w:after="40"/>
               <w:jc w:val="center"/>
             </w:pPr>
             <w:r>
               <w:drawing>
                 <wp:inline distT="0" distB="0" distL="0" distR="0">
-                  <wp:extent cx="2381250" cy="819150"/>
+                  <wp:extent cx="2381250" cy="904875"/>
                   <wp:effectExtent t="0" r="0" b="0" l="0"/>
                   <wp:docPr id="1" name="" descr="" title=""/>
                   <wp:cNvGraphicFramePr>
@@ -326,7 +326,7 @@
                         <pic:spPr bwMode="auto">
                           <a:xfrm>
                             <a:off x="0" y="0"/>
-                            <a:ext cx="2381250" cy="819150"/>
+                            <a:ext cx="2381250" cy="904875"/>
                           </a:xfrm>
                           <a:prstGeom prst="rect">
                             <a:avLst/>
@@ -344,7 +344,7 @@
               <w:tabs>
                 <w:tab w:val="right" w:pos="3640" w:leader="underscore"/>
               </w:tabs>
-              <w:spacing w:before="250"/>
+              <w:spacing w:before="240"/>
             </w:pPr>
             <w:r>
               <w:rPr>
@@ -361,7 +361,7 @@
               <w:tabs>
                 <w:tab w:val="right" w:pos="3640" w:leader="underscore"/>
               </w:tabs>
-              <w:spacing w:before="250"/>
+              <w:spacing w:before="240"/>
             </w:pPr>
             <w:r>
               <w:rPr>
@@ -378,7 +378,7 @@
               <w:tabs>
                 <w:tab w:val="right" w:pos="3640" w:leader="underscore"/>
               </w:tabs>
-              <w:spacing w:before="250"/>
+              <w:spacing w:before="240"/>
             </w:pPr>
             <w:r>
               <w:rPr>
@@ -395,7 +395,7 @@
               <w:tabs>
                 <w:tab w:val="right" w:pos="3640" w:leader="underscore"/>
               </w:tabs>
-              <w:spacing w:before="250"/>
+              <w:spacing w:before="240"/>
             </w:pPr>
             <w:r>
               <w:rPr>
@@ -412,7 +412,7 @@
               <w:tabs>
                 <w:tab w:val="right" w:pos="3640" w:leader="underscore"/>
               </w:tabs>
-              <w:spacing w:before="250"/>
+              <w:spacing w:before="240"/>
             </w:pPr>
             <w:r>
               <w:rPr>
@@ -429,7 +429,7 @@
               <w:tabs>
                 <w:tab w:val="right" w:pos="3640" w:leader="underscore"/>
               </w:tabs>
-              <w:spacing w:before="250"/>
+              <w:spacing w:before="240"/>
             </w:pPr>
             <w:r>
               <w:rPr>
@@ -458,20 +458,20 @@
               <w:right w:val="none" w:color="FFFFFF" w:sz="0"/>
             </w:tcBorders>
             <w:tcMar>
-              <w:top w:type="dxa" w:w="60"/>
+              <w:top w:type="dxa" w:w="40"/>
               <w:left w:type="dxa" w:w="80"/>
               <w:right w:type="dxa" w:w="80"/>
             </w:tcMar>
           </w:tcPr>
           <w:p>
             <w:pPr>
-              <w:spacing w:after="60"/>
+              <w:spacing w:after="40"/>
               <w:jc w:val="center"/>
             </w:pPr>
             <w:r>
               <w:drawing>
                 <wp:inline distT="0" distB="0" distL="0" distR="0">
-                  <wp:extent cx="2381250" cy="819150"/>
+                  <wp:extent cx="2381250" cy="904875"/>
                   <wp:effectExtent t="0" r="0" b="0" l="0"/>
                   <wp:docPr id="1" name="" descr="" title=""/>
                   <wp:cNvGraphicFramePr>
@@ -496,7 +496,7 @@
                         <pic:spPr bwMode="auto">
                           <a:xfrm>
                             <a:off x="0" y="0"/>
-                            <a:ext cx="2381250" cy="819150"/>
+                            <a:ext cx="2381250" cy="904875"/>
                           </a:xfrm>
                           <a:prstGeom prst="rect">
                             <a:avLst/>
@@ -514,7 +514,7 @@
               <w:tabs>
                 <w:tab w:val="right" w:pos="3640" w:leader="underscore"/>
               </w:tabs>
-              <w:spacing w:before="250"/>
+              <w:spacing w:before="240"/>
             </w:pPr>
             <w:r>
               <w:rPr>
@@ -531,7 +531,7 @@
               <w:tabs>
                 <w:tab w:val="right" w:pos="3640" w:leader="underscore"/>
               </w:tabs>
-              <w:spacing w:before="250"/>
+              <w:spacing w:before="240"/>
             </w:pPr>
             <w:r>
               <w:rPr>
@@ -548,7 +548,7 @@
               <w:tabs>
                 <w:tab w:val="right" w:pos="3640" w:leader="underscore"/>
               </w:tabs>
-              <w:spacing w:before="250"/>
+              <w:spacing w:before="240"/>
             </w:pPr>
             <w:r>
               <w:rPr>
@@ -565,7 +565,7 @@
               <w:tabs>
                 <w:tab w:val="right" w:pos="3640" w:leader="underscore"/>
               </w:tabs>
-              <w:spacing w:before="250"/>
+              <w:spacing w:before="240"/>
             </w:pPr>
             <w:r>
               <w:rPr>
@@ -582,7 +582,7 @@
               <w:tabs>
                 <w:tab w:val="right" w:pos="3640" w:leader="underscore"/>
               </w:tabs>
-              <w:spacing w:before="250"/>
+              <w:spacing w:before="240"/>
             </w:pPr>
             <w:r>
               <w:rPr>
@@ -599,7 +599,7 @@
               <w:tabs>
                 <w:tab w:val="right" w:pos="3640" w:leader="underscore"/>
               </w:tabs>
-              <w:spacing w:before="250"/>
+              <w:spacing w:before="240"/>
             </w:pPr>
             <w:r>
               <w:rPr>
@@ -634,20 +634,20 @@
               <w:right w:val="none" w:color="FFFFFF" w:sz="0"/>
             </w:tcBorders>
             <w:tcMar>
-              <w:top w:type="dxa" w:w="60"/>
+              <w:top w:type="dxa" w:w="40"/>
               <w:left w:type="dxa" w:w="80"/>
               <w:right w:type="dxa" w:w="80"/>
             </w:tcMar>
           </w:tcPr>
           <w:p>
             <w:pPr>
-              <w:spacing w:after="60"/>
+              <w:spacing w:after="40"/>
               <w:jc w:val="center"/>
             </w:pPr>
             <w:r>
               <w:drawing>
                 <wp:inline distT="0" distB="0" distL="0" distR="0">
-                  <wp:extent cx="2381250" cy="819150"/>
+                  <wp:extent cx="2381250" cy="904875"/>
                   <wp:effectExtent t="0" r="0" b="0" l="0"/>
                   <wp:docPr id="1" name="" descr="" title=""/>
                   <wp:cNvGraphicFramePr>
@@ -672,7 +672,7 @@
                         <pic:spPr bwMode="auto">
                           <a:xfrm>
                             <a:off x="0" y="0"/>
-                            <a:ext cx="2381250" cy="819150"/>
+                            <a:ext cx="2381250" cy="904875"/>
                           </a:xfrm>
                           <a:prstGeom prst="rect">
                             <a:avLst/>
@@ -690,7 +690,7 @@
               <w:tabs>
                 <w:tab w:val="right" w:pos="3640" w:leader="underscore"/>
               </w:tabs>
-              <w:spacing w:before="250"/>
+              <w:spacing w:before="240"/>
             </w:pPr>
             <w:r>
               <w:rPr>
@@ -707,7 +707,7 @@
               <w:tabs>
                 <w:tab w:val="right" w:pos="3640" w:leader="underscore"/>
               </w:tabs>
-              <w:spacing w:before="250"/>
+              <w:spacing w:before="240"/>
             </w:pPr>
             <w:r>
               <w:rPr>
@@ -724,7 +724,7 @@
               <w:tabs>
                 <w:tab w:val="right" w:pos="3640" w:leader="underscore"/>
               </w:tabs>
-              <w:spacing w:before="250"/>
+              <w:spacing w:before="240"/>
             </w:pPr>
             <w:r>
               <w:rPr>
@@ -741,7 +741,7 @@
               <w:tabs>
                 <w:tab w:val="right" w:pos="3640" w:leader="underscore"/>
               </w:tabs>
-              <w:spacing w:before="250"/>
+              <w:spacing w:before="240"/>
             </w:pPr>
             <w:r>
               <w:rPr>
@@ -758,7 +758,7 @@
               <w:tabs>
                 <w:tab w:val="right" w:pos="3640" w:leader="underscore"/>
               </w:tabs>
-              <w:spacing w:before="250"/>
+              <w:spacing w:before="240"/>
             </w:pPr>
             <w:r>
               <w:rPr>
@@ -775,7 +775,7 @@
               <w:tabs>
                 <w:tab w:val="right" w:pos="3640" w:leader="underscore"/>
               </w:tabs>
-              <w:spacing w:before="250"/>
+              <w:spacing w:before="240"/>
             </w:pPr>
             <w:r>
               <w:rPr>
@@ -804,20 +804,20 @@
               <w:right w:val="none" w:color="FFFFFF" w:sz="0"/>
             </w:tcBorders>
             <w:tcMar>
-              <w:top w:type="dxa" w:w="60"/>
+              <w:top w:type="dxa" w:w="40"/>
               <w:left w:type="dxa" w:w="80"/>
               <w:right w:type="dxa" w:w="80"/>
             </w:tcMar>
           </w:tcPr>
           <w:p>
             <w:pPr>
-              <w:spacing w:after="60"/>
+              <w:spacing w:after="40"/>
               <w:jc w:val="center"/>
             </w:pPr>
             <w:r>
               <w:drawing>
                 <wp:inline distT="0" distB="0" distL="0" distR="0">
-                  <wp:extent cx="2381250" cy="819150"/>
+                  <wp:extent cx="2381250" cy="904875"/>
                   <wp:effectExtent t="0" r="0" b="0" l="0"/>
                   <wp:docPr id="1" name="" descr="" title=""/>
                   <wp:cNvGraphicFramePr>
@@ -842,7 +842,7 @@
                         <pic:spPr bwMode="auto">
                           <a:xfrm>
                             <a:off x="0" y="0"/>
-                            <a:ext cx="2381250" cy="819150"/>
+                            <a:ext cx="2381250" cy="904875"/>
                           </a:xfrm>
                           <a:prstGeom prst="rect">
                             <a:avLst/>
@@ -860,7 +860,7 @@
               <w:tabs>
                 <w:tab w:val="right" w:pos="3640" w:leader="underscore"/>
               </w:tabs>
-              <w:spacing w:before="250"/>
+              <w:spacing w:before="240"/>
             </w:pPr>
             <w:r>
               <w:rPr>
@@ -877,7 +877,7 @@
               <w:tabs>
                 <w:tab w:val="right" w:pos="3640" w:leader="underscore"/>
               </w:tabs>
-              <w:spacing w:before="250"/>
+              <w:spacing w:before="240"/>
             </w:pPr>
             <w:r>
               <w:rPr>
@@ -894,7 +894,7 @@
               <w:tabs>
                 <w:tab w:val="right" w:pos="3640" w:leader="underscore"/>
               </w:tabs>
-              <w:spacing w:before="250"/>
+              <w:spacing w:before="240"/>
             </w:pPr>
             <w:r>
               <w:rPr>
@@ -911,7 +911,7 @@
               <w:tabs>
                 <w:tab w:val="right" w:pos="3640" w:leader="underscore"/>
               </w:tabs>
-              <w:spacing w:before="250"/>
+              <w:spacing w:before="240"/>
             </w:pPr>
             <w:r>
               <w:rPr>
@@ -928,7 +928,7 @@
               <w:tabs>
                 <w:tab w:val="right" w:pos="3640" w:leader="underscore"/>
               </w:tabs>
-              <w:spacing w:before="250"/>
+              <w:spacing w:before="240"/>
             </w:pPr>
             <w:r>
               <w:rPr>
@@ -945,7 +945,7 @@
               <w:tabs>
                 <w:tab w:val="right" w:pos="3640" w:leader="underscore"/>
               </w:tabs>
-              <w:spacing w:before="250"/>
+              <w:spacing w:before="240"/>
             </w:pPr>
             <w:r>
               <w:rPr>
@@ -980,20 +980,20 @@
               <w:right w:val="none" w:color="FFFFFF" w:sz="0"/>
             </w:tcBorders>
             <w:tcMar>
-              <w:top w:type="dxa" w:w="60"/>
+              <w:top w:type="dxa" w:w="40"/>
               <w:left w:type="dxa" w:w="80"/>
               <w:right w:type="dxa" w:w="80"/>
             </w:tcMar>
           </w:tcPr>
           <w:p>
             <w:pPr>
-              <w:spacing w:after="60"/>
+              <w:spacing w:after="40"/>
               <w:jc w:val="center"/>
             </w:pPr>
             <w:r>
               <w:drawing>
                 <wp:inline distT="0" distB="0" distL="0" distR="0">
-                  <wp:extent cx="2381250" cy="819150"/>
+                  <wp:extent cx="2381250" cy="904875"/>
                   <wp:effectExtent t="0" r="0" b="0" l="0"/>
                   <wp:docPr id="1" name="" descr="" title=""/>
                   <wp:cNvGraphicFramePr>
@@ -1018,7 +1018,7 @@
                         <pic:spPr bwMode="auto">
                           <a:xfrm>
                             <a:off x="0" y="0"/>
-                            <a:ext cx="2381250" cy="819150"/>
+                            <a:ext cx="2381250" cy="904875"/>
                           </a:xfrm>
                           <a:prstGeom prst="rect">
                             <a:avLst/>
@@ -1036,7 +1036,7 @@
               <w:tabs>
                 <w:tab w:val="right" w:pos="3640" w:leader="underscore"/>
               </w:tabs>
-              <w:spacing w:before="250"/>
+              <w:spacing w:before="240"/>
             </w:pPr>
             <w:r>
               <w:rPr>
@@ -1053,7 +1053,7 @@
               <w:tabs>
                 <w:tab w:val="right" w:pos="3640" w:leader="underscore"/>
               </w:tabs>
-              <w:spacing w:before="250"/>
+              <w:spacing w:before="240"/>
             </w:pPr>
             <w:r>
               <w:rPr>
@@ -1070,7 +1070,7 @@
               <w:tabs>
                 <w:tab w:val="right" w:pos="3640" w:leader="underscore"/>
               </w:tabs>
-              <w:spacing w:before="250"/>
+              <w:spacing w:before="240"/>
             </w:pPr>
             <w:r>
               <w:rPr>
@@ -1087,7 +1087,7 @@
               <w:tabs>
                 <w:tab w:val="right" w:pos="3640" w:leader="underscore"/>
               </w:tabs>
-              <w:spacing w:before="250"/>
+              <w:spacing w:before="240"/>
             </w:pPr>
             <w:r>
               <w:rPr>
@@ -1104,7 +1104,7 @@
               <w:tabs>
                 <w:tab w:val="right" w:pos="3640" w:leader="underscore"/>
               </w:tabs>
-              <w:spacing w:before="250"/>
+              <w:spacing w:before="240"/>
             </w:pPr>
             <w:r>
               <w:rPr>
@@ -1121,7 +1121,7 @@
               <w:tabs>
                 <w:tab w:val="right" w:pos="3640" w:leader="underscore"/>
               </w:tabs>
-              <w:spacing w:before="250"/>
+              <w:spacing w:before="240"/>
             </w:pPr>
             <w:r>
               <w:rPr>
@@ -2187,7 +2187,7 @@
     </w:p>
     <w:p>
       <w:pPr>
-        <w:spacing w:after="240"/>
+        <w:spacing w:after="200"/>
       </w:pPr>
       <w:r>
         <w:rPr>
@@ -2234,20 +2234,20 @@
               <w:right w:val="none" w:color="FFFFFF" w:sz="0"/>
             </w:tcBorders>
             <w:tcMar>
-              <w:top w:type="dxa" w:w="60"/>
+              <w:top w:type="dxa" w:w="40"/>
               <w:left w:type="dxa" w:w="80"/>
               <w:right w:type="dxa" w:w="80"/>
             </w:tcMar>
           </w:tcPr>
           <w:p>
             <w:pPr>
-              <w:spacing w:after="60"/>
+              <w:spacing w:after="40"/>
               <w:jc w:val="center"/>
             </w:pPr>
             <w:r>
               <w:drawing>
                 <wp:inline distT="0" distB="0" distL="0" distR="0">
-                  <wp:extent cx="2381250" cy="819150"/>
+                  <wp:extent cx="2381250" cy="904875"/>
                   <wp:effectExtent t="0" r="0" b="0" l="0"/>
                   <wp:docPr id="1" name="" descr="" title=""/>
                   <wp:cNvGraphicFramePr>
@@ -2272,7 +2272,7 @@
                         <pic:spPr bwMode="auto">
                           <a:xfrm>
                             <a:off x="0" y="0"/>
-                            <a:ext cx="2381250" cy="819150"/>
+                            <a:ext cx="2381250" cy="904875"/>
                           </a:xfrm>
                           <a:prstGeom prst="rect">
                             <a:avLst/>
@@ -2297,7 +2297,6 @@
             <w:r>
               <w:rPr>
                 <w:rFonts w:ascii="Comic Sans MS" w:cs="Comic Sans MS" w:eastAsia="Comic Sans MS" w:hAnsi="Comic Sans MS"/>
-                <w:color w:val="16243A"/>
                 <w:sz w:val="21"/>
                 <w:szCs w:val="21"/>
               </w:rPr>
@@ -2316,7 +2315,6 @@
             <w:r>
               <w:rPr>
                 <w:rFonts w:ascii="Comic Sans MS" w:cs="Comic Sans MS" w:eastAsia="Comic Sans MS" w:hAnsi="Comic Sans MS"/>
-                <w:color w:val="16243A"/>
                 <w:sz w:val="21"/>
                 <w:szCs w:val="21"/>
               </w:rPr>
@@ -2335,7 +2333,6 @@
             <w:r>
               <w:rPr>
                 <w:rFonts w:ascii="Comic Sans MS" w:cs="Comic Sans MS" w:eastAsia="Comic Sans MS" w:hAnsi="Comic Sans MS"/>
-                <w:color w:val="16243A"/>
                 <w:sz w:val="21"/>
                 <w:szCs w:val="21"/>
               </w:rPr>
@@ -2354,7 +2351,6 @@
             <w:r>
               <w:rPr>
                 <w:rFonts w:ascii="Comic Sans MS" w:cs="Comic Sans MS" w:eastAsia="Comic Sans MS" w:hAnsi="Comic Sans MS"/>
-                <w:color w:val="16243A"/>
                 <w:sz w:val="21"/>
                 <w:szCs w:val="21"/>
               </w:rPr>
@@ -2373,7 +2369,6 @@
             <w:r>
               <w:rPr>
                 <w:rFonts w:ascii="Comic Sans MS" w:cs="Comic Sans MS" w:eastAsia="Comic Sans MS" w:hAnsi="Comic Sans MS"/>
-                <w:color w:val="16243A"/>
                 <w:sz w:val="21"/>
                 <w:szCs w:val="21"/>
               </w:rPr>
@@ -2392,7 +2387,6 @@
             <w:r>
               <w:rPr>
                 <w:rFonts w:ascii="Comic Sans MS" w:cs="Comic Sans MS" w:eastAsia="Comic Sans MS" w:hAnsi="Comic Sans MS"/>
-                <w:color w:val="16243A"/>
                 <w:sz w:val="21"/>
                 <w:szCs w:val="21"/>
               </w:rPr>
@@ -2468,20 +2462,20 @@
               <w:right w:val="none" w:color="FFFFFF" w:sz="0"/>
             </w:tcBorders>
             <w:tcMar>
-              <w:top w:type="dxa" w:w="60"/>
+              <w:top w:type="dxa" w:w="40"/>
               <w:left w:type="dxa" w:w="80"/>
               <w:right w:type="dxa" w:w="80"/>
             </w:tcMar>
           </w:tcPr>
           <w:p>
             <w:pPr>
-              <w:spacing w:after="60"/>
+              <w:spacing w:after="40"/>
               <w:jc w:val="center"/>
             </w:pPr>
             <w:r>
               <w:drawing>
                 <wp:inline distT="0" distB="0" distL="0" distR="0">
-                  <wp:extent cx="2381250" cy="819150"/>
+                  <wp:extent cx="2381250" cy="904875"/>
                   <wp:effectExtent t="0" r="0" b="0" l="0"/>
                   <wp:docPr id="1" name="" descr="" title=""/>
                   <wp:cNvGraphicFramePr>
@@ -2506,7 +2500,7 @@
                         <pic:spPr bwMode="auto">
                           <a:xfrm>
                             <a:off x="0" y="0"/>
-                            <a:ext cx="2381250" cy="819150"/>
+                            <a:ext cx="2381250" cy="904875"/>
                           </a:xfrm>
                           <a:prstGeom prst="rect">
                             <a:avLst/>
@@ -2531,7 +2525,6 @@
             <w:r>
               <w:rPr>
                 <w:rFonts w:ascii="Comic Sans MS" w:cs="Comic Sans MS" w:eastAsia="Comic Sans MS" w:hAnsi="Comic Sans MS"/>
-                <w:color w:val="16243A"/>
                 <w:sz w:val="21"/>
                 <w:szCs w:val="21"/>
               </w:rPr>
@@ -2550,7 +2543,6 @@
             <w:r>
               <w:rPr>
                 <w:rFonts w:ascii="Comic Sans MS" w:cs="Comic Sans MS" w:eastAsia="Comic Sans MS" w:hAnsi="Comic Sans MS"/>
-                <w:color w:val="16243A"/>
                 <w:sz w:val="21"/>
                 <w:szCs w:val="21"/>
               </w:rPr>
@@ -2569,7 +2561,6 @@
             <w:r>
               <w:rPr>
                 <w:rFonts w:ascii="Comic Sans MS" w:cs="Comic Sans MS" w:eastAsia="Comic Sans MS" w:hAnsi="Comic Sans MS"/>
-                <w:color w:val="16243A"/>
                 <w:sz w:val="21"/>
                 <w:szCs w:val="21"/>
               </w:rPr>
@@ -2593,20 +2584,20 @@
               <w:right w:val="none" w:color="FFFFFF" w:sz="0"/>
             </w:tcBorders>
             <w:tcMar>
-              <w:top w:type="dxa" w:w="60"/>
+              <w:top w:type="dxa" w:w="40"/>
               <w:left w:type="dxa" w:w="80"/>
               <w:right w:type="dxa" w:w="80"/>
             </w:tcMar>
           </w:tcPr>
           <w:p>
             <w:pPr>
-              <w:spacing w:after="60"/>
+              <w:spacing w:after="40"/>
               <w:jc w:val="center"/>
             </w:pPr>
             <w:r>
               <w:drawing>
                 <wp:inline distT="0" distB="0" distL="0" distR="0">
-                  <wp:extent cx="2381250" cy="819150"/>
+                  <wp:extent cx="2381250" cy="904875"/>
                   <wp:effectExtent t="0" r="0" b="0" l="0"/>
                   <wp:docPr id="1" name="" descr="" title=""/>
                   <wp:cNvGraphicFramePr>
@@ -2631,7 +2622,7 @@
                         <pic:spPr bwMode="auto">
                           <a:xfrm>
                             <a:off x="0" y="0"/>
-                            <a:ext cx="2381250" cy="819150"/>
+                            <a:ext cx="2381250" cy="904875"/>
                           </a:xfrm>
                           <a:prstGeom prst="rect">
                             <a:avLst/>
@@ -2656,7 +2647,6 @@
             <w:r>
               <w:rPr>
                 <w:rFonts w:ascii="Comic Sans MS" w:cs="Comic Sans MS" w:eastAsia="Comic Sans MS" w:hAnsi="Comic Sans MS"/>
-                <w:color w:val="16243A"/>
                 <w:sz w:val="21"/>
                 <w:szCs w:val="21"/>
               </w:rPr>
@@ -2675,7 +2665,6 @@
             <w:r>
               <w:rPr>
                 <w:rFonts w:ascii="Comic Sans MS" w:cs="Comic Sans MS" w:eastAsia="Comic Sans MS" w:hAnsi="Comic Sans MS"/>
-                <w:color w:val="16243A"/>
                 <w:sz w:val="21"/>
                 <w:szCs w:val="21"/>
               </w:rPr>
@@ -2694,7 +2683,6 @@
             <w:r>
               <w:rPr>
                 <w:rFonts w:ascii="Comic Sans MS" w:cs="Comic Sans MS" w:eastAsia="Comic Sans MS" w:hAnsi="Comic Sans MS"/>
-                <w:color w:val="16243A"/>
                 <w:sz w:val="21"/>
                 <w:szCs w:val="21"/>
               </w:rPr>
@@ -2713,7 +2701,6 @@
             <w:r>
               <w:rPr>
                 <w:rFonts w:ascii="Comic Sans MS" w:cs="Comic Sans MS" w:eastAsia="Comic Sans MS" w:hAnsi="Comic Sans MS"/>
-                <w:color w:val="16243A"/>
                 <w:sz w:val="21"/>
                 <w:szCs w:val="21"/>
               </w:rPr>
@@ -2732,7 +2719,6 @@
             <w:r>
               <w:rPr>
                 <w:rFonts w:ascii="Comic Sans MS" w:cs="Comic Sans MS" w:eastAsia="Comic Sans MS" w:hAnsi="Comic Sans MS"/>
-                <w:color w:val="16243A"/>
                 <w:sz w:val="21"/>
                 <w:szCs w:val="21"/>
               </w:rPr>
@@ -2751,7 +2737,6 @@
             <w:r>
               <w:rPr>
                 <w:rFonts w:ascii="Comic Sans MS" w:cs="Comic Sans MS" w:eastAsia="Comic Sans MS" w:hAnsi="Comic Sans MS"/>
-                <w:color w:val="16243A"/>
                 <w:sz w:val="21"/>
                 <w:szCs w:val="21"/>
               </w:rPr>
@@ -2781,20 +2766,20 @@
               <w:right w:val="none" w:color="FFFFFF" w:sz="0"/>
             </w:tcBorders>
             <w:tcMar>
-              <w:top w:type="dxa" w:w="60"/>
+              <w:top w:type="dxa" w:w="40"/>
               <w:left w:type="dxa" w:w="80"/>
               <w:right w:type="dxa" w:w="80"/>
             </w:tcMar>
           </w:tcPr>
           <w:p>
             <w:pPr>
-              <w:spacing w:after="60"/>
+              <w:spacing w:after="40"/>
               <w:jc w:val="center"/>
             </w:pPr>
             <w:r>
               <w:drawing>
                 <wp:inline distT="0" distB="0" distL="0" distR="0">
-                  <wp:extent cx="2381250" cy="819150"/>
+                  <wp:extent cx="2381250" cy="904875"/>
                   <wp:effectExtent t="0" r="0" b="0" l="0"/>
                   <wp:docPr id="1" name="" descr="" title=""/>
                   <wp:cNvGraphicFramePr>
@@ -2819,7 +2804,7 @@
                         <pic:spPr bwMode="auto">
                           <a:xfrm>
                             <a:off x="0" y="0"/>
-                            <a:ext cx="2381250" cy="819150"/>
+                            <a:ext cx="2381250" cy="904875"/>
                           </a:xfrm>
                           <a:prstGeom prst="rect">
                             <a:avLst/>
@@ -2844,7 +2829,6 @@
             <w:r>
               <w:rPr>
                 <w:rFonts w:ascii="Comic Sans MS" w:cs="Comic Sans MS" w:eastAsia="Comic Sans MS" w:hAnsi="Comic Sans MS"/>
-                <w:color w:val="16243A"/>
                 <w:sz w:val="21"/>
                 <w:szCs w:val="21"/>
               </w:rPr>
@@ -2863,7 +2847,6 @@
             <w:r>
               <w:rPr>
                 <w:rFonts w:ascii="Comic Sans MS" w:cs="Comic Sans MS" w:eastAsia="Comic Sans MS" w:hAnsi="Comic Sans MS"/>
-                <w:color w:val="16243A"/>
                 <w:sz w:val="21"/>
                 <w:szCs w:val="21"/>
               </w:rPr>
@@ -2882,7 +2865,6 @@
             <w:r>
               <w:rPr>
                 <w:rFonts w:ascii="Comic Sans MS" w:cs="Comic Sans MS" w:eastAsia="Comic Sans MS" w:hAnsi="Comic Sans MS"/>
-                <w:color w:val="16243A"/>
                 <w:sz w:val="21"/>
                 <w:szCs w:val="21"/>
               </w:rPr>
@@ -2901,7 +2883,6 @@
             <w:r>
               <w:rPr>
                 <w:rFonts w:ascii="Comic Sans MS" w:cs="Comic Sans MS" w:eastAsia="Comic Sans MS" w:hAnsi="Comic Sans MS"/>
-                <w:color w:val="16243A"/>
                 <w:sz w:val="21"/>
                 <w:szCs w:val="21"/>
               </w:rPr>
@@ -2920,7 +2901,6 @@
             <w:r>
               <w:rPr>
                 <w:rFonts w:ascii="Comic Sans MS" w:cs="Comic Sans MS" w:eastAsia="Comic Sans MS" w:hAnsi="Comic Sans MS"/>
-                <w:color w:val="16243A"/>
                 <w:sz w:val="21"/>
                 <w:szCs w:val="21"/>
               </w:rPr>
@@ -2939,7 +2919,6 @@
             <w:r>
               <w:rPr>
                 <w:rFonts w:ascii="Comic Sans MS" w:cs="Comic Sans MS" w:eastAsia="Comic Sans MS" w:hAnsi="Comic Sans MS"/>
-                <w:color w:val="16243A"/>
                 <w:sz w:val="21"/>
                 <w:szCs w:val="21"/>
               </w:rPr>
@@ -2963,20 +2942,20 @@
               <w:right w:val="none" w:color="FFFFFF" w:sz="0"/>
             </w:tcBorders>
             <w:tcMar>
-              <w:top w:type="dxa" w:w="60"/>
+              <w:top w:type="dxa" w:w="40"/>
               <w:left w:type="dxa" w:w="80"/>
               <w:right w:type="dxa" w:w="80"/>
             </w:tcMar>
           </w:tcPr>
           <w:p>
             <w:pPr>
-              <w:spacing w:after="60"/>
+              <w:spacing w:after="40"/>
               <w:jc w:val="center"/>
             </w:pPr>
             <w:r>
               <w:drawing>
                 <wp:inline distT="0" distB="0" distL="0" distR="0">
-                  <wp:extent cx="2381250" cy="819150"/>
+                  <wp:extent cx="2381250" cy="904875"/>
                   <wp:effectExtent t="0" r="0" b="0" l="0"/>
                   <wp:docPr id="1" name="" descr="" title=""/>
                   <wp:cNvGraphicFramePr>
@@ -3001,7 +2980,7 @@
                         <pic:spPr bwMode="auto">
                           <a:xfrm>
                             <a:off x="0" y="0"/>
-                            <a:ext cx="2381250" cy="819150"/>
+                            <a:ext cx="2381250" cy="904875"/>
                           </a:xfrm>
                           <a:prstGeom prst="rect">
                             <a:avLst/>
@@ -3026,7 +3005,6 @@
             <w:r>
               <w:rPr>
                 <w:rFonts w:ascii="Comic Sans MS" w:cs="Comic Sans MS" w:eastAsia="Comic Sans MS" w:hAnsi="Comic Sans MS"/>
-                <w:color w:val="16243A"/>
                 <w:sz w:val="21"/>
                 <w:szCs w:val="21"/>
               </w:rPr>
@@ -3045,7 +3023,6 @@
             <w:r>
               <w:rPr>
                 <w:rFonts w:ascii="Comic Sans MS" w:cs="Comic Sans MS" w:eastAsia="Comic Sans MS" w:hAnsi="Comic Sans MS"/>
-                <w:color w:val="16243A"/>
                 <w:sz w:val="21"/>
                 <w:szCs w:val="21"/>
               </w:rPr>
@@ -3064,7 +3041,6 @@
             <w:r>
               <w:rPr>
                 <w:rFonts w:ascii="Comic Sans MS" w:cs="Comic Sans MS" w:eastAsia="Comic Sans MS" w:hAnsi="Comic Sans MS"/>
-                <w:color w:val="16243A"/>
                 <w:sz w:val="21"/>
                 <w:szCs w:val="21"/>
               </w:rPr>
@@ -3083,7 +3059,6 @@
             <w:r>
               <w:rPr>
                 <w:rFonts w:ascii="Comic Sans MS" w:cs="Comic Sans MS" w:eastAsia="Comic Sans MS" w:hAnsi="Comic Sans MS"/>
-                <w:color w:val="16243A"/>
                 <w:sz w:val="21"/>
                 <w:szCs w:val="21"/>
               </w:rPr>
@@ -3102,7 +3077,6 @@
             <w:r>
               <w:rPr>
                 <w:rFonts w:ascii="Comic Sans MS" w:cs="Comic Sans MS" w:eastAsia="Comic Sans MS" w:hAnsi="Comic Sans MS"/>
-                <w:color w:val="16243A"/>
                 <w:sz w:val="21"/>
                 <w:szCs w:val="21"/>
               </w:rPr>
@@ -3121,7 +3095,6 @@
             <w:r>
               <w:rPr>
                 <w:rFonts w:ascii="Comic Sans MS" w:cs="Comic Sans MS" w:eastAsia="Comic Sans MS" w:hAnsi="Comic Sans MS"/>
-                <w:color w:val="16243A"/>
                 <w:sz w:val="21"/>
                 <w:szCs w:val="21"/>
               </w:rPr>
@@ -3140,7 +3113,6 @@
             <w:r>
               <w:rPr>
                 <w:rFonts w:ascii="Comic Sans MS" w:cs="Comic Sans MS" w:eastAsia="Comic Sans MS" w:hAnsi="Comic Sans MS"/>
-                <w:color w:val="16243A"/>
                 <w:sz w:val="21"/>
                 <w:szCs w:val="21"/>
               </w:rPr>
@@ -3170,20 +3142,20 @@
               <w:right w:val="none" w:color="FFFFFF" w:sz="0"/>
             </w:tcBorders>
             <w:tcMar>
-              <w:top w:type="dxa" w:w="60"/>
+              <w:top w:type="dxa" w:w="40"/>
               <w:left w:type="dxa" w:w="80"/>
               <w:right w:type="dxa" w:w="80"/>
             </w:tcMar>
           </w:tcPr>
           <w:p>
             <w:pPr>
-              <w:spacing w:after="60"/>
+              <w:spacing w:after="40"/>
               <w:jc w:val="center"/>
             </w:pPr>
             <w:r>
               <w:drawing>
                 <wp:inline distT="0" distB="0" distL="0" distR="0">
-                  <wp:extent cx="2381250" cy="819150"/>
+                  <wp:extent cx="2381250" cy="904875"/>
                   <wp:effectExtent t="0" r="0" b="0" l="0"/>
                   <wp:docPr id="1" name="" descr="" title=""/>
                   <wp:cNvGraphicFramePr>
@@ -3208,7 +3180,7 @@
                         <pic:spPr bwMode="auto">
                           <a:xfrm>
                             <a:off x="0" y="0"/>
-                            <a:ext cx="2381250" cy="819150"/>
+                            <a:ext cx="2381250" cy="904875"/>
                           </a:xfrm>
                           <a:prstGeom prst="rect">
                             <a:avLst/>
@@ -3233,7 +3205,6 @@
             <w:r>
               <w:rPr>
                 <w:rFonts w:ascii="Comic Sans MS" w:cs="Comic Sans MS" w:eastAsia="Comic Sans MS" w:hAnsi="Comic Sans MS"/>
-                <w:color w:val="16243A"/>
                 <w:sz w:val="21"/>
                 <w:szCs w:val="21"/>
               </w:rPr>
@@ -3252,7 +3223,6 @@
             <w:r>
               <w:rPr>
                 <w:rFonts w:ascii="Comic Sans MS" w:cs="Comic Sans MS" w:eastAsia="Comic Sans MS" w:hAnsi="Comic Sans MS"/>
-                <w:color w:val="16243A"/>
                 <w:sz w:val="21"/>
                 <w:szCs w:val="21"/>
               </w:rPr>
@@ -3271,7 +3241,6 @@
             <w:r>
               <w:rPr>
                 <w:rFonts w:ascii="Comic Sans MS" w:cs="Comic Sans MS" w:eastAsia="Comic Sans MS" w:hAnsi="Comic Sans MS"/>
-                <w:color w:val="16243A"/>
                 <w:sz w:val="21"/>
                 <w:szCs w:val="21"/>
               </w:rPr>
@@ -3290,7 +3259,6 @@
             <w:r>
               <w:rPr>
                 <w:rFonts w:ascii="Comic Sans MS" w:cs="Comic Sans MS" w:eastAsia="Comic Sans MS" w:hAnsi="Comic Sans MS"/>
-                <w:color w:val="16243A"/>
                 <w:sz w:val="21"/>
                 <w:szCs w:val="21"/>
               </w:rPr>
@@ -3309,7 +3277,6 @@
             <w:r>
               <w:rPr>
                 <w:rFonts w:ascii="Comic Sans MS" w:cs="Comic Sans MS" w:eastAsia="Comic Sans MS" w:hAnsi="Comic Sans MS"/>
-                <w:color w:val="16243A"/>
                 <w:sz w:val="21"/>
                 <w:szCs w:val="21"/>
               </w:rPr>
@@ -3328,7 +3295,6 @@
             <w:r>
               <w:rPr>
                 <w:rFonts w:ascii="Comic Sans MS" w:cs="Comic Sans MS" w:eastAsia="Comic Sans MS" w:hAnsi="Comic Sans MS"/>
-                <w:color w:val="16243A"/>
                 <w:sz w:val="21"/>
                 <w:szCs w:val="21"/>
               </w:rPr>

</xml_diff>